<commit_message>
Update Word reports with repository URL and commit c8c1e25 reference.
Co-authored-by: Cursor <cursoragent@cursor.com>
</commit_message>
<xml_diff>
--- a/reports/Long_Range_Entanglement_Dynamic_Circuits_Report_EN.docx
+++ b/reports/Long_Range_Entanglement_Dynamic_Circuits_Report_EN.docx
@@ -2503,7 +2503,7 @@
           <w:rFonts w:ascii="Courier New" w:hAnsi="Courier New"/>
           <w:sz w:val="17"/>
         </w:rPr>
-        <w:t>git clone https://github.com/YOUR_USERNAME/long-range-entanglement-dynamic-circuits</w:t>
+        <w:t>git clone https://github.com/real-louis/Dynamic-Circuit-Strategies-for-Long-Range-Entanglement-under-Local-Connectivity</w:t>
       </w:r>
     </w:p>
     <w:p>
@@ -2516,7 +2516,7 @@
           <w:rFonts w:ascii="Courier New" w:hAnsi="Courier New"/>
           <w:sz w:val="17"/>
         </w:rPr>
-        <w:t>cd long-range-entanglement-dynamic-circuits</w:t>
+        <w:t>cd Dynamic-Circuit-Strategies-for-Long-Range-Entanglement-under-Local-Connectivity</w:t>
       </w:r>
     </w:p>
     <w:p>
@@ -2659,7 +2659,7 @@
             <w:color w:val="0563C1"/>
             <w:u w:val="single"/>
           </w:rPr>
-          <w:t>https://github.com/YOUR_USERNAME/long-range-entanglement-dynamic-circuits</w:t>
+          <w:t>https://github.com/real-louis/Dynamic-Circuit-Strategies-for-Long-Range-Entanglement-under-Local-Connectivity</w:t>
         </w:r>
       </w:hyperlink>
     </w:p>
@@ -2671,10 +2671,10 @@
       <w:r>
         <w:rPr>
           <w:b w:val="0"/>
-          <w:i/>
+          <w:i w:val="0"/>
           <w:sz w:val="22"/>
         </w:rPr>
-        <w:t>Set repository_commit in config/submission.json after git push, then regenerate this report.</w:t>
+        <w:t>Reproduction reference commit: c8c1e25</w:t>
       </w:r>
     </w:p>
     <w:p>

</xml_diff>

<commit_message>
Trim public repo to English report and reproduction code.
Remove internal grad-application docs, Chinese report, and report-build
scripts; add reproduce.py and English REPRODUCE.md. Author: HE, CHIEN-YI.

Co-authored-by: Cursor <cursoragent@cursor.com>
</commit_message>
<xml_diff>
--- a/reports/Long_Range_Entanglement_Dynamic_Circuits_Report_EN.docx
+++ b/reports/Long_Range_Entanglement_Dynamic_Circuits_Report_EN.docx
@@ -34,7 +34,7 @@
         <w:rPr>
           <w:sz w:val="22"/>
         </w:rPr>
-        <w:t>Jian-Yi He</w:t>
+        <w:t>HE, CHIEN-YI</w:t>
         <w:br/>
         <w:t>Prof. Hsiu-Chuan Hsu</w:t>
         <w:br/>
@@ -2674,7 +2674,7 @@
           <w:i w:val="0"/>
           <w:sz w:val="22"/>
         </w:rPr>
-        <w:t>Reproduction reference commit: c8c1e25</w:t>
+        <w:t>Reproduction reference commit: beece71</w:t>
       </w:r>
     </w:p>
     <w:p>

</xml_diff>

<commit_message>
Update English report: competition layout and PRX mapping table.
Add explicit imitation vs reproduction labels for PRX Quantum 5.030339.

Co-authored-by: Cursor <cursoragent@cursor.com>
</commit_message>
<xml_diff>
--- a/reports/Long_Range_Entanglement_Dynamic_Circuits_Report_EN.docx
+++ b/reports/Long_Range_Entanglement_Dynamic_Circuits_Report_EN.docx
@@ -2,14 +2,16 @@
 <file path=word/document.xml><?xml version="1.0" encoding="utf-8"?>
 <w:document xmlns:wpc="http://schemas.microsoft.com/office/word/2010/wordprocessingCanvas" xmlns:mo="http://schemas.microsoft.com/office/mac/office/2008/main" xmlns:mc="http://schemas.openxmlformats.org/markup-compatibility/2006" xmlns:mv="urn:schemas-microsoft-com:mac:vml" xmlns:o="urn:schemas-microsoft-com:office:office" xmlns:r="http://schemas.openxmlformats.org/officeDocument/2006/relationships" xmlns:m="http://schemas.openxmlformats.org/officeDocument/2006/math" xmlns:v="urn:schemas-microsoft-com:vml" xmlns:wp14="http://schemas.microsoft.com/office/word/2010/wordprocessingDrawing" xmlns:wp="http://schemas.openxmlformats.org/drawingml/2006/wordprocessingDrawing" xmlns:w10="urn:schemas-microsoft-com:office:word" xmlns:w="http://schemas.openxmlformats.org/wordprocessingml/2006/main" xmlns:w14="http://schemas.microsoft.com/office/word/2010/wordml" xmlns:wpg="http://schemas.microsoft.com/office/word/2010/wordprocessingGroup" xmlns:wpi="http://schemas.microsoft.com/office/word/2010/wordprocessingInk" xmlns:wne="http://schemas.microsoft.com/office/word/2006/wordml" xmlns:wps="http://schemas.microsoft.com/office/word/2010/wordprocessingShape" mc:Ignorable="w14 wp14">
   <w:body>
+    <w:p/>
     <w:p>
       <w:pPr>
         <w:jc w:val="center"/>
       </w:pPr>
       <w:r>
         <w:rPr>
+          <w:rFonts w:ascii="Times New Roman" w:hAnsi="Times New Roman"/>
           <w:b/>
-          <w:sz w:val="32"/>
+          <w:sz w:val="34"/>
         </w:rPr>
         <w:t>Dynamic Circuit Strategies for Long-Range Entanglement under Local Connectivity</w:t>
       </w:r>
@@ -20,10 +22,11 @@
       </w:pPr>
       <w:r>
         <w:rPr>
+          <w:rFonts w:ascii="Times New Roman" w:hAnsi="Times New Roman"/>
           <w:i/>
-          <w:sz w:val="24"/>
+          <w:sz w:val="22"/>
         </w:rPr>
-        <w:t>From Ephys Challenge 2026 to PRX Quantum 5.030339</w:t>
+        <w:t>Static Chains, Entanglement Swapping, and PRX Quantum 5.030339 Reproduction</w:t>
       </w:r>
     </w:p>
     <w:p>
@@ -32,7 +35,20 @@
       </w:pPr>
       <w:r>
         <w:rPr>
-          <w:sz w:val="22"/>
+          <w:rFonts w:ascii="Times New Roman" w:hAnsi="Times New Roman"/>
+          <w:i/>
+          <w:sz w:val="18"/>
+        </w:rPr>
+        <w:t>Reproducible simulation study (Qiskit Aer) — integrated graduate project report</w:t>
+      </w:r>
+    </w:p>
+    <w:p>
+      <w:pPr>
+        <w:jc w:val="center"/>
+      </w:pPr>
+      <w:r>
+        <w:rPr>
+          <w:sz w:val="20"/>
         </w:rPr>
         <w:t>HE, CHIEN-YI</w:t>
         <w:br/>
@@ -67,7 +83,7 @@
           <w:i w:val="0"/>
           <w:sz w:val="22"/>
         </w:rPr>
-        <w:t>We study long-range Bell-state preparation on a ladder topology under nearest-neighbor gates, motivated by Ephys Challenge 2026. Strategy A (static GHZ chain, 2L−1 CNOTs) is compared with Strategy B (entanglement swapping, L CNOTs, odd L) under one shared Qiskit Aer noise model (8192 shots). We report resource formulas, ideal CHSH verification (2√2), endpoint diagnostic P(00)+P(11) with 95% Wilson confidence intervals, and a noisy crossover curve. We independently reproduce Fig. 1a/2b circuits from PRX Quantum 5, 030339 (35 pytest checks). A paper error-budget analysis (Appendix B.2) is applied separately to Bell preparation and long-range CNOT tasks; we emphasize qualitative trend mapping—not calibrated equality with simulation.</w:t>
+        <w:t>We study long-range Bell-state preparation between endpoint qubits on a ladder connectivity graph where two-qubit gates are restricted to nearest-neighbor nodes (Ephys Challenge 2026). Strategy A (static GHZ chain, 2L−1 CNOTs) is compared with Strategy B (entanglement swapping, L CNOTs, odd L) under one shared Qiskit Aer noise model (8192 shots). After reading Bäumer et al. (PRX Quantum 5, 030339), we explicitly separate (i) competition-original ladder simulations, (ii) circuit reproduction of Fig. 1(a) and Fig. 2(b), and (iii) qualitative crossover / error-budget analysis mapped to Section III and Appendix B.2. Table 1 lists every paper location and whether we imitate its mechanism or reproduce its circuits.</w:t>
       </w:r>
     </w:p>
     <w:p>
@@ -81,7 +97,7 @@
           <w:i/>
           <w:sz w:val="22"/>
         </w:rPr>
-        <w:t>Keywords: dynamic quantum circuits, long-range entanglement, entanglement swapping, NISQ</w:t>
+        <w:t>Keywords: dynamic quantum circuits, long-range entanglement, entanglement swapping, ladder topology, NISQ</w:t>
       </w:r>
     </w:p>
     <w:p>
@@ -97,7 +113,7 @@
         <w:pStyle w:val="ListBullet"/>
       </w:pPr>
       <w:r>
-        <w:t>Implemented and verified Ephys competition circuits with closed-form CX counts.</w:t>
+        <w:t>Ephys Challenge ladder circuits, resource formulas, and noisy crossover (original competition work).</w:t>
       </w:r>
     </w:p>
     <w:p>
@@ -105,7 +121,7 @@
         <w:pStyle w:val="ListBullet"/>
       </w:pPr>
       <w:r>
-        <w:t>Reproduced PRX Quantum 5.030339 LRCX/GHZ circuits with automated pytest equivalence.</w:t>
+        <w:t>Independent reproduction of PRX Quantum Fig. 1(a) LRCX and Fig. 2(b) GHZ circuits (35 pytest checks).</w:t>
       </w:r>
     </w:p>
     <w:p>
@@ -113,7 +129,7 @@
         <w:pStyle w:val="ListBullet"/>
       </w:pPr>
       <w:r>
-        <w:t>Unified qualitative crossover discussion via separate error-budget and simulation panels.</w:t>
+        <w:t>Paper-mapped error-budget analysis (Appendix B.2) and qualitative crossover discussion (Section III).</w:t>
       </w:r>
     </w:p>
     <w:p>
@@ -122,6 +138,28 @@
       </w:pPr>
       <w:r>
         <w:t>1. Introduction</w:t>
+      </w:r>
+    </w:p>
+    <w:p>
+      <w:pPr>
+        <w:spacing w:after="80"/>
+        <w:ind w:left="173"/>
+      </w:pPr>
+      <w:r>
+        <w:rPr>
+          <w:rFonts w:ascii="Times New Roman" w:hAnsi="Times New Roman"/>
+          <w:b/>
+          <w:sz w:val="19"/>
+        </w:rPr>
+        <w:t xml:space="preserve">▌ PRX qualitative analogy — Introduction — dynamic circuits under local connectivity. </w:t>
+      </w:r>
+      <w:r>
+        <w:rPr>
+          <w:rFonts w:ascii="Times New Roman" w:hAnsi="Times New Roman"/>
+          <w:i/>
+          <w:sz w:val="19"/>
+        </w:rPr>
+        <w:t>Our ladder endpoints e₀,e₁ problem is competition-specific; we use the paper as the benchmark for measurement-based routing and for quantitative circuit reproduction.</w:t>
       </w:r>
     </w:p>
     <w:p>
@@ -135,7 +173,7 @@
           <w:i w:val="0"/>
           <w:sz w:val="22"/>
         </w:rPr>
-        <w:t>Superconducting processors restrict two-qubit gates to nearest neighbors. Dynamic circuits use mid-circuit measurement and feed-forward for effectively constant-depth routing [Bäumer et al., PRX Quantum 5, 030339 (2024)]. We ask: under ladder topology, how do static versus measurement-based Bell preparation trade CX resources against noisy fidelity?</w:t>
+        <w:t>Superconducting processors restrict two-qubit gates to nearest neighbors. Dynamic circuits use mid-circuit measurement and feed-forward for effectively constant-depth routing [Bäumer et al., PRX Quantum 5, 030339 (2024)]. On a ladder graph we ask: under fair noise, how do static GHZ-style Bell preparation and measurement-based entanglement swapping trade CNOT resources against endpoint fidelity?</w:t>
       </w:r>
     </w:p>
     <w:p>
@@ -143,7 +181,7 @@
         <w:pStyle w:val="Heading1"/>
       </w:pPr>
       <w:r>
-        <w:t>2. Problem formulation</w:t>
+        <w:t>2. Bell states and verification</w:t>
       </w:r>
     </w:p>
     <w:p>
@@ -151,7 +189,7 @@
         <w:pStyle w:val="ListBullet"/>
       </w:pPr>
       <w:r>
-        <w:t>Single-rail abstraction: e0↔q0, e1↔qL, L segments, N=L+1 qubits.</w:t>
+        <w:t>Target |Φ+⟩ on endpoints (e₀,e₁) ↔ (q₀,q_L); P(00)+P(11) is the primary noisy diagnostic.</w:t>
       </w:r>
     </w:p>
     <w:p>
@@ -159,7 +197,7 @@
         <w:pStyle w:val="ListBullet"/>
       </w:pPr>
       <w:r>
-        <w:t>Two-rail zigzag uses 2(L+1) qubits on full ladder edges (comparison only).</w:t>
+        <w:t>Ideal checks: statevector partial trace, CHSH correlators (Tsirelson bound 2√2).</w:t>
       </w:r>
     </w:p>
     <w:p>
@@ -167,7 +205,162 @@
         <w:pStyle w:val="ListBullet"/>
       </w:pPr>
       <w:r>
-        <w:t>Target |Φ+⟩; metrics: CHSH, P(00)+P(11), CNOT count.</w:t>
+        <w:t>Swapping uses Bell measurement + X/Z feed-forward (same Pauli-frame logic as PRX LRCX).</w:t>
+      </w:r>
+    </w:p>
+    <w:p>
+      <w:pPr>
+        <w:pStyle w:val="ListBullet"/>
+      </w:pPr>
+      <w:r>
+        <w:t>Static chain: H(e₀) → forward CNOT → backward CNOT uncomputes interior qubits.</w:t>
+      </w:r>
+    </w:p>
+    <w:p>
+      <w:r>
+        <w:drawing>
+          <wp:inline xmlns:a="http://schemas.openxmlformats.org/drawingml/2006/main" xmlns:pic="http://schemas.openxmlformats.org/drawingml/2006/picture">
+            <wp:extent cx="5486400" cy="2262249"/>
+            <wp:docPr id="1" name="Picture 1"/>
+            <wp:cNvGraphicFramePr>
+              <a:graphicFrameLocks noChangeAspect="1"/>
+            </wp:cNvGraphicFramePr>
+            <a:graphic>
+              <a:graphicData uri="http://schemas.openxmlformats.org/drawingml/2006/picture">
+                <pic:pic>
+                  <pic:nvPicPr>
+                    <pic:cNvPr id="0" name="figure_topology_ladder.png"/>
+                    <pic:cNvPicPr/>
+                  </pic:nvPicPr>
+                  <pic:blipFill>
+                    <a:blip r:embed="rId9"/>
+                    <a:stretch>
+                      <a:fillRect/>
+                    </a:stretch>
+                  </pic:blipFill>
+                  <pic:spPr>
+                    <a:xfrm>
+                      <a:off x="0" y="0"/>
+                      <a:ext cx="5486400" cy="2262249"/>
+                    </a:xfrm>
+                    <a:prstGeom prst="rect"/>
+                  </pic:spPr>
+                </pic:pic>
+              </a:graphicData>
+            </a:graphic>
+          </wp:inline>
+        </w:drawing>
+      </w:r>
+    </w:p>
+    <w:p>
+      <w:pPr>
+        <w:spacing w:after="240"/>
+        <w:jc w:val="center"/>
+      </w:pPr>
+      <w:r>
+        <w:rPr>
+          <w:i/>
+          <w:sz w:val="20"/>
+        </w:rPr>
+        <w:t>Figure 1. Ladder topology and endpoint notation (competition setting).</w:t>
+      </w:r>
+    </w:p>
+    <w:p>
+      <w:r>
+        <w:drawing>
+          <wp:inline xmlns:a="http://schemas.openxmlformats.org/drawingml/2006/main" xmlns:pic="http://schemas.openxmlformats.org/drawingml/2006/picture">
+            <wp:extent cx="5486400" cy="1989045"/>
+            <wp:docPr id="2" name="Picture 2"/>
+            <wp:cNvGraphicFramePr>
+              <a:graphicFrameLocks noChangeAspect="1"/>
+            </wp:cNvGraphicFramePr>
+            <a:graphic>
+              <a:graphicData uri="http://schemas.openxmlformats.org/drawingml/2006/picture">
+                <pic:pic>
+                  <pic:nvPicPr>
+                    <pic:cNvPr id="0" name="figure_topology_single_rail.png"/>
+                    <pic:cNvPicPr/>
+                  </pic:nvPicPr>
+                  <pic:blipFill>
+                    <a:blip r:embed="rId10"/>
+                    <a:stretch>
+                      <a:fillRect/>
+                    </a:stretch>
+                  </pic:blipFill>
+                  <pic:spPr>
+                    <a:xfrm>
+                      <a:off x="0" y="0"/>
+                      <a:ext cx="5486400" cy="1989045"/>
+                    </a:xfrm>
+                    <a:prstGeom prst="rect"/>
+                  </pic:spPr>
+                </pic:pic>
+              </a:graphicData>
+            </a:graphic>
+          </wp:inline>
+        </w:drawing>
+      </w:r>
+    </w:p>
+    <w:p>
+      <w:pPr>
+        <w:spacing w:after="240"/>
+        <w:jc w:val="center"/>
+      </w:pPr>
+      <w:r>
+        <w:rPr>
+          <w:i/>
+          <w:sz w:val="20"/>
+        </w:rPr>
+        <w:t>Figure 2. Strategy A: single-rail static chain abstraction.</w:t>
+      </w:r>
+    </w:p>
+    <w:p>
+      <w:r>
+        <w:drawing>
+          <wp:inline xmlns:a="http://schemas.openxmlformats.org/drawingml/2006/main" xmlns:pic="http://schemas.openxmlformats.org/drawingml/2006/picture">
+            <wp:extent cx="5486400" cy="2398816"/>
+            <wp:docPr id="3" name="Picture 3"/>
+            <wp:cNvGraphicFramePr>
+              <a:graphicFrameLocks noChangeAspect="1"/>
+            </wp:cNvGraphicFramePr>
+            <a:graphic>
+              <a:graphicData uri="http://schemas.openxmlformats.org/drawingml/2006/picture">
+                <pic:pic>
+                  <pic:nvPicPr>
+                    <pic:cNvPr id="0" name="figure_topology_zigzag.png"/>
+                    <pic:cNvPicPr/>
+                  </pic:nvPicPr>
+                  <pic:blipFill>
+                    <a:blip r:embed="rId11"/>
+                    <a:stretch>
+                      <a:fillRect/>
+                    </a:stretch>
+                  </pic:blipFill>
+                  <pic:spPr>
+                    <a:xfrm>
+                      <a:off x="0" y="0"/>
+                      <a:ext cx="5486400" cy="2398816"/>
+                    </a:xfrm>
+                    <a:prstGeom prst="rect"/>
+                  </pic:spPr>
+                </pic:pic>
+              </a:graphicData>
+            </a:graphic>
+          </wp:inline>
+        </w:drawing>
+      </w:r>
+    </w:p>
+    <w:p>
+      <w:pPr>
+        <w:spacing w:after="240"/>
+        <w:jc w:val="center"/>
+      </w:pPr>
+      <w:r>
+        <w:rPr>
+          <w:i/>
+          <w:sz w:val="20"/>
+        </w:rPr>
+        <w:t>Figure 3. Zigzag Hamiltonian path on the ladder (reference topology).</w:t>
       </w:r>
     </w:p>
     <w:p>
@@ -183,7 +376,29 @@
         <w:pStyle w:val="Heading2"/>
       </w:pPr>
       <w:r>
-        <w:t>3.1 Strategies A and B</w:t>
+        <w:t>3.1 Circuit families (Ephys Challenge)</w:t>
+      </w:r>
+    </w:p>
+    <w:p>
+      <w:pPr>
+        <w:spacing w:after="80"/>
+        <w:ind w:left="173"/>
+      </w:pPr>
+      <w:r>
+        <w:rPr>
+          <w:rFonts w:ascii="Times New Roman" w:hAnsi="Times New Roman"/>
+          <w:b/>
+          <w:sz w:val="19"/>
+        </w:rPr>
+        <w:t xml:space="preserve">▌ PRX mechanism (imitation) — Bell measurement + Pauli feed-forward throughout Fig. 1(a). </w:t>
+      </w:r>
+      <w:r>
+        <w:rPr>
+          <w:rFonts w:ascii="Times New Roman" w:hAnsi="Times New Roman"/>
+          <w:i/>
+          <w:sz w:val="19"/>
+        </w:rPr>
+        <w:t>Strategy B (entanglement swapping) implements the same teleportation-style frame corrections as the dynamic LRCX branch, adapted to ladder Bell preparation rather than gate teleportation.</w:t>
       </w:r>
     </w:p>
     <w:p>
@@ -197,7 +412,7 @@
           <w:i w:val="0"/>
           <w:sz w:val="22"/>
         </w:rPr>
-        <w:t>Strategy A: H(e0) → forward CX → reverse CX (2L−1 CNOTs). Strategy B: adjacent |Φ+⟩ pairs, Bell measurement, X/Z feed-forward (L CNOTs, odd L). Noisy runs use classical post-decode when if_test is unstable in Aer.</w:t>
+        <w:t>Strategy A: H(e₀) → forward CX → reverse CX (2L−1 CNOTs). Strategy B: adjacent |Φ+⟩ pairs, Bell measurement, X/Z feed-forward (L CNOTs, odd L). Zigzag uses 2(L+1) qubits on full ladder edges (topology reference). Noisy runs use classical post-decode when if_test is unstable in Aer.</w:t>
       </w:r>
     </w:p>
     <w:p>
@@ -205,7 +420,7 @@
         <w:pStyle w:val="Heading2"/>
       </w:pPr>
       <w:r>
-        <w:t>3.2 Fair noise model</w:t>
+        <w:t>3.2 Shared noise model (Ephys simulations)</w:t>
       </w:r>
     </w:p>
     <w:p>
@@ -217,7 +432,7 @@
           <w:i/>
           <w:sz w:val="20"/>
         </w:rPr>
-        <w:t>Table 1. Shared Aer noise parameters.</w:t>
+        <w:t>Table 2. Shared Aer noise parameters (not PRX device calibration).</w:t>
       </w:r>
     </w:p>
     <w:tbl>
@@ -228,14 +443,14 @@
         <w:tblLook w:firstColumn="1" w:firstRow="1" w:lastColumn="0" w:lastRow="0" w:noHBand="0" w:noVBand="1" w:val="04A0"/>
       </w:tblPr>
       <w:tblGrid>
-        <w:gridCol w:w="2880"/>
-        <w:gridCol w:w="2880"/>
-        <w:gridCol w:w="2880"/>
+        <w:gridCol w:w="3245"/>
+        <w:gridCol w:w="3245"/>
+        <w:gridCol w:w="3245"/>
       </w:tblGrid>
       <w:tr>
         <w:tc>
           <w:tcPr>
-            <w:tcW w:type="dxa" w:w="2880"/>
+            <w:tcW w:type="dxa" w:w="3245"/>
           </w:tcPr>
           <w:p>
             <w:r>
@@ -249,7 +464,7 @@
         </w:tc>
         <w:tc>
           <w:tcPr>
-            <w:tcW w:type="dxa" w:w="2880"/>
+            <w:tcW w:type="dxa" w:w="3245"/>
           </w:tcPr>
           <w:p>
             <w:r>
@@ -263,7 +478,7 @@
         </w:tc>
         <w:tc>
           <w:tcPr>
-            <w:tcW w:type="dxa" w:w="2880"/>
+            <w:tcW w:type="dxa" w:w="3245"/>
           </w:tcPr>
           <w:p>
             <w:r>
@@ -279,7 +494,7 @@
       <w:tr>
         <w:tc>
           <w:tcPr>
-            <w:tcW w:type="dxa" w:w="2880"/>
+            <w:tcW w:type="dxa" w:w="3245"/>
           </w:tcPr>
           <w:p>
             <w:r>
@@ -292,7 +507,7 @@
         </w:tc>
         <w:tc>
           <w:tcPr>
-            <w:tcW w:type="dxa" w:w="2880"/>
+            <w:tcW w:type="dxa" w:w="3245"/>
           </w:tcPr>
           <w:p>
             <w:r>
@@ -305,7 +520,7 @@
         </w:tc>
         <w:tc>
           <w:tcPr>
-            <w:tcW w:type="dxa" w:w="2880"/>
+            <w:tcW w:type="dxa" w:w="3245"/>
           </w:tcPr>
           <w:p>
             <w:r>
@@ -320,7 +535,7 @@
       <w:tr>
         <w:tc>
           <w:tcPr>
-            <w:tcW w:type="dxa" w:w="2880"/>
+            <w:tcW w:type="dxa" w:w="3245"/>
           </w:tcPr>
           <w:p>
             <w:r>
@@ -333,7 +548,7 @@
         </w:tc>
         <w:tc>
           <w:tcPr>
-            <w:tcW w:type="dxa" w:w="2880"/>
+            <w:tcW w:type="dxa" w:w="3245"/>
           </w:tcPr>
           <w:p>
             <w:r>
@@ -346,7 +561,7 @@
         </w:tc>
         <w:tc>
           <w:tcPr>
-            <w:tcW w:type="dxa" w:w="2880"/>
+            <w:tcW w:type="dxa" w:w="3245"/>
           </w:tcPr>
           <w:p>
             <w:r>
@@ -361,7 +576,7 @@
       <w:tr>
         <w:tc>
           <w:tcPr>
-            <w:tcW w:type="dxa" w:w="2880"/>
+            <w:tcW w:type="dxa" w:w="3245"/>
           </w:tcPr>
           <w:p>
             <w:r>
@@ -374,7 +589,7 @@
         </w:tc>
         <w:tc>
           <w:tcPr>
-            <w:tcW w:type="dxa" w:w="2880"/>
+            <w:tcW w:type="dxa" w:w="3245"/>
           </w:tcPr>
           <w:p>
             <w:r>
@@ -387,7 +602,7 @@
         </w:tc>
         <w:tc>
           <w:tcPr>
-            <w:tcW w:type="dxa" w:w="2880"/>
+            <w:tcW w:type="dxa" w:w="3245"/>
           </w:tcPr>
           <w:p>
             <w:r>
@@ -402,7 +617,7 @@
       <w:tr>
         <w:tc>
           <w:tcPr>
-            <w:tcW w:type="dxa" w:w="2880"/>
+            <w:tcW w:type="dxa" w:w="3245"/>
           </w:tcPr>
           <w:p>
             <w:r>
@@ -415,7 +630,7 @@
         </w:tc>
         <w:tc>
           <w:tcPr>
-            <w:tcW w:type="dxa" w:w="2880"/>
+            <w:tcW w:type="dxa" w:w="3245"/>
           </w:tcPr>
           <w:p>
             <w:r>
@@ -428,7 +643,7 @@
         </w:tc>
         <w:tc>
           <w:tcPr>
-            <w:tcW w:type="dxa" w:w="2880"/>
+            <w:tcW w:type="dxa" w:w="3245"/>
           </w:tcPr>
           <w:p>
             <w:r>
@@ -447,7 +662,730 @@
         <w:pStyle w:val="Heading2"/>
       </w:pPr>
       <w:r>
-        <w:t>3.3 PRX Quantum 5.030339 reproduction</w:t>
+        <w:t>3.3 PRX Quantum 5.030339: imitation vs. reproduction map</w:t>
+      </w:r>
+    </w:p>
+    <w:p>
+      <w:pPr>
+        <w:spacing w:after="120"/>
+        <w:jc w:val="both"/>
+      </w:pPr>
+      <w:r>
+        <w:rPr>
+          <w:b w:val="0"/>
+          <w:i w:val="0"/>
+          <w:sz w:val="22"/>
+        </w:rPr>
+        <w:t>The following table is the central reference for reviewers: each row cites a specific location in PRX Quantum 5, 030339 and states whether our work reproduces the published circuit/analysis or only imitates the underlying mechanism / draws a qualitative analogy. Reproduce = rebuilt circuits or formulas with automated tests; Imitate = same physics idea in a different task; Qualitative analogy = compare trends only (different noise calibration).</w:t>
+      </w:r>
+    </w:p>
+    <w:p>
+      <w:pPr>
+        <w:spacing w:after="120"/>
+      </w:pPr>
+      <w:r>
+        <w:rPr>
+          <w:i/>
+          <w:sz w:val="20"/>
+        </w:rPr>
+        <w:t>Table 1. Mapping to Bäumer et al., PRX Quantum 5, 030339 (2024): what we imitate vs. reproduce.</w:t>
+      </w:r>
+    </w:p>
+    <w:tbl>
+      <w:tblPr>
+        <w:tblStyle w:val="TableGrid"/>
+        <w:tblW w:type="auto" w:w="0"/>
+        <w:jc w:val="center"/>
+        <w:tblLook w:firstColumn="1" w:firstRow="1" w:lastColumn="0" w:lastRow="0" w:noHBand="0" w:noVBand="1" w:val="04A0"/>
+      </w:tblPr>
+      <w:tblGrid>
+        <w:gridCol w:w="2433"/>
+        <w:gridCol w:w="2433"/>
+        <w:gridCol w:w="2433"/>
+        <w:gridCol w:w="2433"/>
+      </w:tblGrid>
+      <w:tr>
+        <w:tc>
+          <w:tcPr>
+            <w:tcW w:type="dxa" w:w="2433"/>
+          </w:tcPr>
+          <w:p>
+            <w:r>
+              <w:rPr>
+                <w:b/>
+                <w:sz w:val="18"/>
+              </w:rPr>
+              <w:t>Paper location</w:t>
+            </w:r>
+          </w:p>
+        </w:tc>
+        <w:tc>
+          <w:tcPr>
+            <w:tcW w:type="dxa" w:w="2433"/>
+          </w:tcPr>
+          <w:p>
+            <w:r>
+              <w:rPr>
+                <w:b/>
+                <w:sz w:val="18"/>
+              </w:rPr>
+              <w:t>Relation</w:t>
+            </w:r>
+          </w:p>
+        </w:tc>
+        <w:tc>
+          <w:tcPr>
+            <w:tcW w:type="dxa" w:w="2433"/>
+          </w:tcPr>
+          <w:p>
+            <w:r>
+              <w:rPr>
+                <w:b/>
+                <w:sz w:val="18"/>
+              </w:rPr>
+              <w:t>This report</w:t>
+            </w:r>
+          </w:p>
+        </w:tc>
+        <w:tc>
+          <w:tcPr>
+            <w:tcW w:type="dxa" w:w="2433"/>
+          </w:tcPr>
+          <w:p>
+            <w:r>
+              <w:rPr>
+                <w:b/>
+                <w:sz w:val="18"/>
+              </w:rPr>
+              <w:t>Code / artifact</w:t>
+            </w:r>
+          </w:p>
+        </w:tc>
+      </w:tr>
+      <w:tr>
+        <w:tc>
+          <w:tcPr>
+            <w:tcW w:type="dxa" w:w="2433"/>
+          </w:tcPr>
+          <w:p>
+            <w:r>
+              <w:rPr>
+                <w:sz w:val="18"/>
+              </w:rPr>
+              <w:t>Fig. 1(a), right — dynamic LRCX + feed-forward</w:t>
+            </w:r>
+          </w:p>
+        </w:tc>
+        <w:tc>
+          <w:tcPr>
+            <w:tcW w:type="dxa" w:w="2433"/>
+          </w:tcPr>
+          <w:p>
+            <w:r>
+              <w:rPr>
+                <w:sz w:val="18"/>
+              </w:rPr>
+              <w:t>Reproduce</w:t>
+            </w:r>
+          </w:p>
+        </w:tc>
+        <w:tc>
+          <w:tcPr>
+            <w:tcW w:type="dxa" w:w="2433"/>
+          </w:tcPr>
+          <w:p>
+            <w:r>
+              <w:rPr>
+                <w:sz w:val="18"/>
+              </w:rPr>
+              <w:t>§4.4, Table 4</w:t>
+            </w:r>
+          </w:p>
+        </w:tc>
+        <w:tc>
+          <w:tcPr>
+            <w:tcW w:type="dxa" w:w="2433"/>
+          </w:tcPr>
+          <w:p>
+            <w:r>
+              <w:rPr>
+                <w:sz w:val="18"/>
+              </w:rPr>
+              <w:t>prx/circuits/cnot_teleportation.py; pytest (35 passed)</w:t>
+            </w:r>
+          </w:p>
+        </w:tc>
+      </w:tr>
+      <w:tr>
+        <w:tc>
+          <w:tcPr>
+            <w:tcW w:type="dxa" w:w="2433"/>
+          </w:tcPr>
+          <w:p>
+            <w:r>
+              <w:rPr>
+                <w:sz w:val="18"/>
+              </w:rPr>
+              <w:t>Fig. 1(a), middle — unitary ancilla + SWAP</w:t>
+            </w:r>
+          </w:p>
+        </w:tc>
+        <w:tc>
+          <w:tcPr>
+            <w:tcW w:type="dxa" w:w="2433"/>
+          </w:tcPr>
+          <w:p>
+            <w:r>
+              <w:rPr>
+                <w:sz w:val="18"/>
+              </w:rPr>
+              <w:t>Reproduce</w:t>
+            </w:r>
+          </w:p>
+        </w:tc>
+        <w:tc>
+          <w:tcPr>
+            <w:tcW w:type="dxa" w:w="2433"/>
+          </w:tcPr>
+          <w:p>
+            <w:r>
+              <w:rPr>
+                <w:sz w:val="18"/>
+              </w:rPr>
+              <w:t>§4.4, Table 4</w:t>
+            </w:r>
+          </w:p>
+        </w:tc>
+        <w:tc>
+          <w:tcPr>
+            <w:tcW w:type="dxa" w:w="2433"/>
+          </w:tcPr>
+          <w:p>
+            <w:r>
+              <w:rPr>
+                <w:sz w:val="18"/>
+              </w:rPr>
+              <w:t>build_cnot_unitary_swap(); build_cnot_unitary_ancilla_ic()</w:t>
+            </w:r>
+          </w:p>
+        </w:tc>
+      </w:tr>
+      <w:tr>
+        <w:tc>
+          <w:tcPr>
+            <w:tcW w:type="dxa" w:w="2433"/>
+          </w:tcPr>
+          <w:p>
+            <w:r>
+              <w:rPr>
+                <w:sz w:val="18"/>
+              </w:rPr>
+              <w:t>Fig. 1(a), left — measure then classically correct</w:t>
+            </w:r>
+          </w:p>
+        </w:tc>
+        <w:tc>
+          <w:tcPr>
+            <w:tcW w:type="dxa" w:w="2433"/>
+          </w:tcPr>
+          <w:p>
+            <w:r>
+              <w:rPr>
+                <w:sz w:val="18"/>
+              </w:rPr>
+              <w:t>Reproduce</w:t>
+            </w:r>
+          </w:p>
+        </w:tc>
+        <w:tc>
+          <w:tcPr>
+            <w:tcW w:type="dxa" w:w="2433"/>
+          </w:tcPr>
+          <w:p>
+            <w:r>
+              <w:rPr>
+                <w:sz w:val="18"/>
+              </w:rPr>
+              <w:t>§4.4</w:t>
+            </w:r>
+          </w:p>
+        </w:tc>
+        <w:tc>
+          <w:tcPr>
+            <w:tcW w:type="dxa" w:w="2433"/>
+          </w:tcPr>
+          <w:p>
+            <w:r>
+              <w:rPr>
+                <w:sz w:val="18"/>
+              </w:rPr>
+              <w:t>build_cnot_postprocessing(); simulate_cnot_branches()</w:t>
+            </w:r>
+          </w:p>
+        </w:tc>
+      </w:tr>
+      <w:tr>
+        <w:tc>
+          <w:tcPr>
+            <w:tcW w:type="dxa" w:w="2433"/>
+          </w:tcPr>
+          <w:p>
+            <w:r>
+              <w:rPr>
+                <w:sz w:val="18"/>
+              </w:rPr>
+              <w:t>Fig. 2(b), left — unitary GHZ chain</w:t>
+            </w:r>
+          </w:p>
+        </w:tc>
+        <w:tc>
+          <w:tcPr>
+            <w:tcW w:type="dxa" w:w="2433"/>
+          </w:tcPr>
+          <w:p>
+            <w:r>
+              <w:rPr>
+                <w:sz w:val="18"/>
+              </w:rPr>
+              <w:t>Reproduce</w:t>
+            </w:r>
+          </w:p>
+        </w:tc>
+        <w:tc>
+          <w:tcPr>
+            <w:tcW w:type="dxa" w:w="2433"/>
+          </w:tcPr>
+          <w:p>
+            <w:r>
+              <w:rPr>
+                <w:sz w:val="18"/>
+              </w:rPr>
+              <w:t>§4.4, Table 5</w:t>
+            </w:r>
+          </w:p>
+        </w:tc>
+        <w:tc>
+          <w:tcPr>
+            <w:tcW w:type="dxa" w:w="2433"/>
+          </w:tcPr>
+          <w:p>
+            <w:r>
+              <w:rPr>
+                <w:sz w:val="18"/>
+              </w:rPr>
+              <w:t>prx/circuits/ghz_preparation.py → build_ghz_unitary()</w:t>
+            </w:r>
+          </w:p>
+        </w:tc>
+      </w:tr>
+      <w:tr>
+        <w:tc>
+          <w:tcPr>
+            <w:tcW w:type="dxa" w:w="2433"/>
+          </w:tcPr>
+          <w:p>
+            <w:r>
+              <w:rPr>
+                <w:sz w:val="18"/>
+              </w:rPr>
+              <w:t>Fig. 2(b), right — dynamic GHZ (O(1) 2Q depth)</w:t>
+            </w:r>
+          </w:p>
+        </w:tc>
+        <w:tc>
+          <w:tcPr>
+            <w:tcW w:type="dxa" w:w="2433"/>
+          </w:tcPr>
+          <w:p>
+            <w:r>
+              <w:rPr>
+                <w:sz w:val="18"/>
+              </w:rPr>
+              <w:t>Reproduce</w:t>
+            </w:r>
+          </w:p>
+        </w:tc>
+        <w:tc>
+          <w:tcPr>
+            <w:tcW w:type="dxa" w:w="2433"/>
+          </w:tcPr>
+          <w:p>
+            <w:r>
+              <w:rPr>
+                <w:sz w:val="18"/>
+              </w:rPr>
+              <w:t>§4.4, Table 5</w:t>
+            </w:r>
+          </w:p>
+        </w:tc>
+        <w:tc>
+          <w:tcPr>
+            <w:tcW w:type="dxa" w:w="2433"/>
+          </w:tcPr>
+          <w:p>
+            <w:r>
+              <w:rPr>
+                <w:sz w:val="18"/>
+              </w:rPr>
+              <w:t>build_ghz_dynamic(); count_ghz_dynamic_resources()</w:t>
+            </w:r>
+          </w:p>
+        </w:tc>
+      </w:tr>
+      <w:tr>
+        <w:tc>
+          <w:tcPr>
+            <w:tcW w:type="dxa" w:w="2433"/>
+          </w:tcPr>
+          <w:p>
+            <w:r>
+              <w:rPr>
+                <w:sz w:val="18"/>
+              </w:rPr>
+              <w:t>Fig. 2(c) — gate / depth resources vs distance</w:t>
+            </w:r>
+          </w:p>
+        </w:tc>
+        <w:tc>
+          <w:tcPr>
+            <w:tcW w:type="dxa" w:w="2433"/>
+          </w:tcPr>
+          <w:p>
+            <w:r>
+              <w:rPr>
+                <w:sz w:val="18"/>
+              </w:rPr>
+              <w:t>Qualitative analogy</w:t>
+            </w:r>
+          </w:p>
+        </w:tc>
+        <w:tc>
+          <w:tcPr>
+            <w:tcW w:type="dxa" w:w="2433"/>
+          </w:tcPr>
+          <w:p>
+            <w:r>
+              <w:rPr>
+                <w:sz w:val="18"/>
+              </w:rPr>
+              <w:t>§4.1, Figure 1, Table 2</w:t>
+            </w:r>
+          </w:p>
+        </w:tc>
+        <w:tc>
+          <w:tcPr>
+            <w:tcW w:type="dxa" w:w="2433"/>
+          </w:tcPr>
+          <w:p>
+            <w:r>
+              <w:rPr>
+                <w:sz w:val="18"/>
+              </w:rPr>
+              <w:t>ephys/competition_suite.py → resource_formula_table.csv</w:t>
+            </w:r>
+          </w:p>
+        </w:tc>
+      </w:tr>
+      <w:tr>
+        <w:tc>
+          <w:tcPr>
+            <w:tcW w:type="dxa" w:w="2433"/>
+          </w:tcPr>
+          <w:p>
+            <w:r>
+              <w:rPr>
+                <w:sz w:val="18"/>
+              </w:rPr>
+              <w:t>Sec. III — dynamic vs. unitary crossover (hardware)</w:t>
+            </w:r>
+          </w:p>
+        </w:tc>
+        <w:tc>
+          <w:tcPr>
+            <w:tcW w:type="dxa" w:w="2433"/>
+          </w:tcPr>
+          <w:p>
+            <w:r>
+              <w:rPr>
+                <w:sz w:val="18"/>
+              </w:rPr>
+              <w:t>Qualitative analogy</w:t>
+            </w:r>
+          </w:p>
+        </w:tc>
+        <w:tc>
+          <w:tcPr>
+            <w:tcW w:type="dxa" w:w="2433"/>
+          </w:tcPr>
+          <w:p>
+            <w:r>
+              <w:rPr>
+                <w:sz w:val="18"/>
+              </w:rPr>
+              <w:t>§4.3, Figure 3, §5</w:t>
+            </w:r>
+          </w:p>
+        </w:tc>
+        <w:tc>
+          <w:tcPr>
+            <w:tcW w:type="dxa" w:w="2433"/>
+          </w:tcPr>
+          <w:p>
+            <w:r>
+              <w:rPr>
+                <w:sz w:val="18"/>
+              </w:rPr>
+              <w:t>Static vs. swapping under shared Aer noise (Wilson 95% CI)</w:t>
+            </w:r>
+          </w:p>
+        </w:tc>
+      </w:tr>
+      <w:tr>
+        <w:tc>
+          <w:tcPr>
+            <w:tcW w:type="dxa" w:w="2433"/>
+          </w:tcPr>
+          <w:p>
+            <w:r>
+              <w:rPr>
+                <w:sz w:val="18"/>
+              </w:rPr>
+              <w:t>Appendix B.2 — λ_tot error budget</w:t>
+            </w:r>
+          </w:p>
+        </w:tc>
+        <w:tc>
+          <w:tcPr>
+            <w:tcW w:type="dxa" w:w="2433"/>
+          </w:tcPr>
+          <w:p>
+            <w:r>
+              <w:rPr>
+                <w:sz w:val="18"/>
+              </w:rPr>
+              <w:t>Reproduce (analysis)</w:t>
+            </w:r>
+          </w:p>
+        </w:tc>
+        <w:tc>
+          <w:tcPr>
+            <w:tcW w:type="dxa" w:w="2433"/>
+          </w:tcPr>
+          <w:p>
+            <w:r>
+              <w:rPr>
+                <w:sz w:val="18"/>
+              </w:rPr>
+              <w:t>§4.5, Figures 4–5</w:t>
+            </w:r>
+          </w:p>
+        </w:tc>
+        <w:tc>
+          <w:tcPr>
+            <w:tcW w:type="dxa" w:w="2433"/>
+          </w:tcPr>
+          <w:p>
+            <w:r>
+              <w:rPr>
+                <w:sz w:val="18"/>
+              </w:rPr>
+              <w:t>scripts/error_budget_analysis.py (μ, λ_idle, λ_CNOT, λ_meas from paper)</w:t>
+            </w:r>
+          </w:p>
+        </w:tc>
+      </w:tr>
+      <w:tr>
+        <w:tc>
+          <w:tcPr>
+            <w:tcW w:type="dxa" w:w="2433"/>
+          </w:tcPr>
+          <w:p>
+            <w:r>
+              <w:rPr>
+                <w:sz w:val="18"/>
+              </w:rPr>
+              <w:t>Bell measurement + Pauli feed-forward (throughout)</w:t>
+            </w:r>
+          </w:p>
+        </w:tc>
+        <w:tc>
+          <w:tcPr>
+            <w:tcW w:type="dxa" w:w="2433"/>
+          </w:tcPr>
+          <w:p>
+            <w:r>
+              <w:rPr>
+                <w:sz w:val="18"/>
+              </w:rPr>
+              <w:t>Mechanism imitation</w:t>
+            </w:r>
+          </w:p>
+        </w:tc>
+        <w:tc>
+          <w:tcPr>
+            <w:tcW w:type="dxa" w:w="2433"/>
+          </w:tcPr>
+          <w:p>
+            <w:r>
+              <w:rPr>
+                <w:sz w:val="18"/>
+              </w:rPr>
+              <w:t>§3.1, §4.3, Figure 7</w:t>
+            </w:r>
+          </w:p>
+        </w:tc>
+        <w:tc>
+          <w:tcPr>
+            <w:tcW w:type="dxa" w:w="2433"/>
+          </w:tcPr>
+          <w:p>
+            <w:r>
+              <w:rPr>
+                <w:sz w:val="18"/>
+              </w:rPr>
+              <w:t>ephys generate_swapping_circuit() — Strategy B (odd L)</w:t>
+            </w:r>
+          </w:p>
+        </w:tc>
+      </w:tr>
+      <w:tr>
+        <w:tc>
+          <w:tcPr>
+            <w:tcW w:type="dxa" w:w="2433"/>
+          </w:tcPr>
+          <w:p>
+            <w:r>
+              <w:rPr>
+                <w:sz w:val="18"/>
+              </w:rPr>
+              <w:t>Static GHZ-style chain (unitary entangling sweep)</w:t>
+            </w:r>
+          </w:p>
+        </w:tc>
+        <w:tc>
+          <w:tcPr>
+            <w:tcW w:type="dxa" w:w="2433"/>
+          </w:tcPr>
+          <w:p>
+            <w:r>
+              <w:rPr>
+                <w:sz w:val="18"/>
+              </w:rPr>
+              <w:t>Conceptual analogy to Fig. 2(b) left</w:t>
+            </w:r>
+          </w:p>
+        </w:tc>
+        <w:tc>
+          <w:tcPr>
+            <w:tcW w:type="dxa" w:w="2433"/>
+          </w:tcPr>
+          <w:p>
+            <w:r>
+              <w:rPr>
+                <w:sz w:val="18"/>
+              </w:rPr>
+              <w:t>§3.1, §4.1, Figure 6</w:t>
+            </w:r>
+          </w:p>
+        </w:tc>
+        <w:tc>
+          <w:tcPr>
+            <w:tcW w:type="dxa" w:w="2433"/>
+          </w:tcPr>
+          <w:p>
+            <w:r>
+              <w:rPr>
+                <w:sz w:val="18"/>
+              </w:rPr>
+              <w:t>ephys generate_ladder_bell_circuit() — Strategy A</w:t>
+            </w:r>
+          </w:p>
+        </w:tc>
+      </w:tr>
+      <w:tr>
+        <w:tc>
+          <w:tcPr>
+            <w:tcW w:type="dxa" w:w="2433"/>
+          </w:tcPr>
+          <w:p>
+            <w:r>
+              <w:rPr>
+                <w:sz w:val="18"/>
+              </w:rPr>
+              <w:t>Intro: dynamic circuits under local connectivity</w:t>
+            </w:r>
+          </w:p>
+        </w:tc>
+        <w:tc>
+          <w:tcPr>
+            <w:tcW w:type="dxa" w:w="2433"/>
+          </w:tcPr>
+          <w:p>
+            <w:r>
+              <w:rPr>
+                <w:sz w:val="18"/>
+              </w:rPr>
+              <w:t>Motivation (context)</w:t>
+            </w:r>
+          </w:p>
+        </w:tc>
+        <w:tc>
+          <w:tcPr>
+            <w:tcW w:type="dxa" w:w="2433"/>
+          </w:tcPr>
+          <w:p>
+            <w:r>
+              <w:rPr>
+                <w:sz w:val="18"/>
+              </w:rPr>
+              <w:t>§1</w:t>
+            </w:r>
+          </w:p>
+        </w:tc>
+        <w:tc>
+          <w:tcPr>
+            <w:tcW w:type="dxa" w:w="2433"/>
+          </w:tcPr>
+          <w:p>
+            <w:r>
+              <w:rPr>
+                <w:sz w:val="18"/>
+              </w:rPr>
+              <w:t>Ephys ladder endpoints e₀,e₁; not a hardware claim</w:t>
+            </w:r>
+          </w:p>
+        </w:tc>
+      </w:tr>
+    </w:tbl>
+    <w:p/>
+    <w:p>
+      <w:pPr>
+        <w:pStyle w:val="Heading2"/>
+      </w:pPr>
+      <w:r>
+        <w:t>3.4 PRX circuit reproduction (code)</w:t>
+      </w:r>
+    </w:p>
+    <w:p>
+      <w:pPr>
+        <w:spacing w:after="80"/>
+        <w:ind w:left="173"/>
+      </w:pPr>
+      <w:r>
+        <w:rPr>
+          <w:rFonts w:ascii="Times New Roman" w:hAnsi="Times New Roman"/>
+          <w:b/>
+          <w:sz w:val="19"/>
+        </w:rPr>
+        <w:t xml:space="preserve">▌ PRX reproduce — Fig. 1(a) and Fig. 2(b) — full circuit families. </w:t>
+      </w:r>
+      <w:r>
+        <w:rPr>
+          <w:rFonts w:ascii="Times New Roman" w:hAnsi="Times New Roman"/>
+          <w:i/>
+          <w:sz w:val="19"/>
+        </w:rPr>
+        <w:t>35 pytest assertions on statevector fidelity and dynamic/unitary equivalence; see Table 4–5.</w:t>
       </w:r>
     </w:p>
     <w:p>
@@ -503,11 +1441,33 @@
       </w:r>
     </w:p>
     <w:p>
+      <w:pPr>
+        <w:spacing w:after="80"/>
+        <w:ind w:left="173"/>
+      </w:pPr>
+      <w:r>
+        <w:rPr>
+          <w:rFonts w:ascii="Times New Roman" w:hAnsi="Times New Roman"/>
+          <w:b/>
+          <w:sz w:val="19"/>
+        </w:rPr>
+        <w:t xml:space="preserve">▌ PRX qualitative analogy — Fig. 2(c) — CNOT / depth scaling. </w:t>
+      </w:r>
+      <w:r>
+        <w:rPr>
+          <w:rFonts w:ascii="Times New Roman" w:hAnsi="Times New Roman"/>
+          <w:i/>
+          <w:sz w:val="19"/>
+        </w:rPr>
+        <w:t>Our ideal CNOT vs L plot mirrors the paper's resource comparison spirit; Strategy A aligns with unitary GHZ scaling (2L−1), swapping with lower CX for odd L.</w:t>
+      </w:r>
+    </w:p>
+    <w:p>
       <w:r>
         <w:drawing>
           <wp:inline xmlns:a="http://schemas.openxmlformats.org/drawingml/2006/main" xmlns:pic="http://schemas.openxmlformats.org/drawingml/2006/picture">
             <wp:extent cx="5486400" cy="2880360"/>
-            <wp:docPr id="1" name="Picture 1"/>
+            <wp:docPr id="4" name="Picture 4"/>
             <wp:cNvGraphicFramePr>
               <a:graphicFrameLocks noChangeAspect="1"/>
             </wp:cNvGraphicFramePr>
@@ -519,7 +1479,7 @@
                     <pic:cNvPicPr/>
                   </pic:nvPicPr>
                   <pic:blipFill>
-                    <a:blip r:embed="rId9"/>
+                    <a:blip r:embed="rId12"/>
                     <a:stretch>
                       <a:fillRect/>
                     </a:stretch>
@@ -548,7 +1508,7 @@
           <w:i/>
           <w:sz w:val="20"/>
         </w:rPr>
-        <w:t>Figure 1. Ideal CNOT count vs L.</w:t>
+        <w:t>Figure 4. Ideal CNOT count vs L.</w:t>
       </w:r>
     </w:p>
     <w:p>
@@ -560,7 +1520,7 @@
           <w:i/>
           <w:sz w:val="20"/>
         </w:rPr>
-        <w:t>Table 2. Resources at L=5 (from resource_formula_table.csv).</w:t>
+        <w:t>Table 3. Resources at L=5 (from resource_formula_table.csv).</w:t>
       </w:r>
     </w:p>
     <w:tbl>
@@ -571,15 +1531,15 @@
         <w:tblLook w:firstColumn="1" w:firstRow="1" w:lastColumn="0" w:lastRow="0" w:noHBand="0" w:noVBand="1" w:val="04A0"/>
       </w:tblPr>
       <w:tblGrid>
-        <w:gridCol w:w="2160"/>
-        <w:gridCol w:w="2160"/>
-        <w:gridCol w:w="2160"/>
-        <w:gridCol w:w="2160"/>
+        <w:gridCol w:w="2433"/>
+        <w:gridCol w:w="2433"/>
+        <w:gridCol w:w="2433"/>
+        <w:gridCol w:w="2433"/>
       </w:tblGrid>
       <w:tr>
         <w:tc>
           <w:tcPr>
-            <w:tcW w:type="dxa" w:w="2160"/>
+            <w:tcW w:type="dxa" w:w="2433"/>
           </w:tcPr>
           <w:p>
             <w:r>
@@ -593,7 +1553,7 @@
         </w:tc>
         <w:tc>
           <w:tcPr>
-            <w:tcW w:type="dxa" w:w="2160"/>
+            <w:tcW w:type="dxa" w:w="2433"/>
           </w:tcPr>
           <w:p>
             <w:r>
@@ -607,7 +1567,7 @@
         </w:tc>
         <w:tc>
           <w:tcPr>
-            <w:tcW w:type="dxa" w:w="2160"/>
+            <w:tcW w:type="dxa" w:w="2433"/>
           </w:tcPr>
           <w:p>
             <w:r>
@@ -621,7 +1581,7 @@
         </w:tc>
         <w:tc>
           <w:tcPr>
-            <w:tcW w:type="dxa" w:w="2160"/>
+            <w:tcW w:type="dxa" w:w="2433"/>
           </w:tcPr>
           <w:p>
             <w:r>
@@ -637,7 +1597,7 @@
       <w:tr>
         <w:tc>
           <w:tcPr>
-            <w:tcW w:type="dxa" w:w="2160"/>
+            <w:tcW w:type="dxa" w:w="2433"/>
           </w:tcPr>
           <w:p>
             <w:r>
@@ -650,7 +1610,7 @@
         </w:tc>
         <w:tc>
           <w:tcPr>
-            <w:tcW w:type="dxa" w:w="2160"/>
+            <w:tcW w:type="dxa" w:w="2433"/>
           </w:tcPr>
           <w:p>
             <w:r>
@@ -663,7 +1623,7 @@
         </w:tc>
         <w:tc>
           <w:tcPr>
-            <w:tcW w:type="dxa" w:w="2160"/>
+            <w:tcW w:type="dxa" w:w="2433"/>
           </w:tcPr>
           <w:p>
             <w:r>
@@ -676,7 +1636,7 @@
         </w:tc>
         <w:tc>
           <w:tcPr>
-            <w:tcW w:type="dxa" w:w="2160"/>
+            <w:tcW w:type="dxa" w:w="2433"/>
           </w:tcPr>
           <w:p>
             <w:r>
@@ -691,7 +1651,7 @@
       <w:tr>
         <w:tc>
           <w:tcPr>
-            <w:tcW w:type="dxa" w:w="2160"/>
+            <w:tcW w:type="dxa" w:w="2433"/>
           </w:tcPr>
           <w:p>
             <w:r>
@@ -704,7 +1664,7 @@
         </w:tc>
         <w:tc>
           <w:tcPr>
-            <w:tcW w:type="dxa" w:w="2160"/>
+            <w:tcW w:type="dxa" w:w="2433"/>
           </w:tcPr>
           <w:p>
             <w:r>
@@ -717,7 +1677,7 @@
         </w:tc>
         <w:tc>
           <w:tcPr>
-            <w:tcW w:type="dxa" w:w="2160"/>
+            <w:tcW w:type="dxa" w:w="2433"/>
           </w:tcPr>
           <w:p>
             <w:r>
@@ -730,7 +1690,7 @@
         </w:tc>
         <w:tc>
           <w:tcPr>
-            <w:tcW w:type="dxa" w:w="2160"/>
+            <w:tcW w:type="dxa" w:w="2433"/>
           </w:tcPr>
           <w:p>
             <w:r>
@@ -745,7 +1705,7 @@
       <w:tr>
         <w:tc>
           <w:tcPr>
-            <w:tcW w:type="dxa" w:w="2160"/>
+            <w:tcW w:type="dxa" w:w="2433"/>
           </w:tcPr>
           <w:p>
             <w:r>
@@ -758,7 +1718,7 @@
         </w:tc>
         <w:tc>
           <w:tcPr>
-            <w:tcW w:type="dxa" w:w="2160"/>
+            <w:tcW w:type="dxa" w:w="2433"/>
           </w:tcPr>
           <w:p>
             <w:r>
@@ -771,7 +1731,7 @@
         </w:tc>
         <w:tc>
           <w:tcPr>
-            <w:tcW w:type="dxa" w:w="2160"/>
+            <w:tcW w:type="dxa" w:w="2433"/>
           </w:tcPr>
           <w:p>
             <w:r>
@@ -784,7 +1744,7 @@
         </w:tc>
         <w:tc>
           <w:tcPr>
-            <w:tcW w:type="dxa" w:w="2160"/>
+            <w:tcW w:type="dxa" w:w="2433"/>
           </w:tcPr>
           <w:p>
             <w:r>
@@ -807,11 +1767,33 @@
       </w:r>
     </w:p>
     <w:p>
+      <w:pPr>
+        <w:spacing w:after="80"/>
+        <w:ind w:left="173"/>
+      </w:pPr>
+      <w:r>
+        <w:rPr>
+          <w:rFonts w:ascii="Times New Roman" w:hAnsi="Times New Roman"/>
+          <w:b/>
+          <w:sz w:val="19"/>
+        </w:rPr>
+        <w:t xml:space="preserve">▌ Ephys Challenge (original) — —. </w:t>
+      </w:r>
+      <w:r>
+        <w:rPr>
+          <w:rFonts w:ascii="Times New Roman" w:hAnsi="Times New Roman"/>
+          <w:i/>
+          <w:sz w:val="19"/>
+        </w:rPr>
+        <w:t>Ideal CHSH sanity check for |Φ+⟩ endpoints (Ephys competition analysis).</w:t>
+      </w:r>
+    </w:p>
+    <w:p>
       <w:r>
         <w:drawing>
           <wp:inline xmlns:a="http://schemas.openxmlformats.org/drawingml/2006/main" xmlns:pic="http://schemas.openxmlformats.org/drawingml/2006/picture">
             <wp:extent cx="5486400" cy="4717774"/>
-            <wp:docPr id="2" name="Picture 2"/>
+            <wp:docPr id="5" name="Picture 5"/>
             <wp:cNvGraphicFramePr>
               <a:graphicFrameLocks noChangeAspect="1"/>
             </wp:cNvGraphicFramePr>
@@ -823,7 +1805,7 @@
                     <pic:cNvPicPr/>
                   </pic:nvPicPr>
                   <pic:blipFill>
-                    <a:blip r:embed="rId10"/>
+                    <a:blip r:embed="rId13"/>
                     <a:stretch>
                       <a:fillRect/>
                     </a:stretch>
@@ -852,7 +1834,7 @@
           <w:i/>
           <w:sz w:val="20"/>
         </w:rPr>
-        <w:t>Figure 2. CHSH correlator: ideal (flat at 2√2) vs noisy static/zigzag.</w:t>
+        <w:t>Figure 5. CHSH correlator: ideal (flat at 2√2) vs noisy static/zigzag.</w:t>
       </w:r>
     </w:p>
     <w:p>
@@ -860,7 +1842,29 @@
         <w:pStyle w:val="Heading2"/>
       </w:pPr>
       <w:r>
-        <w:t>4.3 Noisy Bell diagnostic</w:t>
+        <w:t>4.3 Noisy Bell diagnostic and crossover</w:t>
+      </w:r>
+    </w:p>
+    <w:p>
+      <w:pPr>
+        <w:spacing w:after="80"/>
+        <w:ind w:left="173"/>
+      </w:pPr>
+      <w:r>
+        <w:rPr>
+          <w:rFonts w:ascii="Times New Roman" w:hAnsi="Times New Roman"/>
+          <w:b/>
+          <w:sz w:val="19"/>
+        </w:rPr>
+        <w:t xml:space="preserve">▌ PRX qualitative analogy — Section III — dynamic vs. unitary crossover on hardware. </w:t>
+      </w:r>
+      <w:r>
+        <w:rPr>
+          <w:rFonts w:ascii="Times New Roman" w:hAnsi="Times New Roman"/>
+          <w:i/>
+          <w:sz w:val="19"/>
+        </w:rPr>
+        <w:t>Static (unitary-depth) vs. swapping (measurement-heavy) under Aer noise parallels the paper's short-distance unitary advantage and long-distance dynamic trend; parameters differ — trends only.</w:t>
       </w:r>
     </w:p>
     <w:p>
@@ -872,7 +1876,7 @@
           <w:i/>
           <w:sz w:val="20"/>
         </w:rPr>
-        <w:t>Table 3. P(00)+P(11) with 95% Wilson CI (8192 shots).</w:t>
+        <w:t>Table 4. P(00)+P(11) with 95% Wilson CI (8192 shots).</w:t>
       </w:r>
     </w:p>
     <w:tbl>
@@ -883,15 +1887,15 @@
         <w:tblLook w:firstColumn="1" w:firstRow="1" w:lastColumn="0" w:lastRow="0" w:noHBand="0" w:noVBand="1" w:val="04A0"/>
       </w:tblPr>
       <w:tblGrid>
-        <w:gridCol w:w="2160"/>
-        <w:gridCol w:w="2160"/>
-        <w:gridCol w:w="2160"/>
-        <w:gridCol w:w="2160"/>
+        <w:gridCol w:w="2433"/>
+        <w:gridCol w:w="2433"/>
+        <w:gridCol w:w="2433"/>
+        <w:gridCol w:w="2433"/>
       </w:tblGrid>
       <w:tr>
         <w:tc>
           <w:tcPr>
-            <w:tcW w:type="dxa" w:w="2160"/>
+            <w:tcW w:type="dxa" w:w="2433"/>
           </w:tcPr>
           <w:p>
             <w:r>
@@ -905,7 +1909,7 @@
         </w:tc>
         <w:tc>
           <w:tcPr>
-            <w:tcW w:type="dxa" w:w="2160"/>
+            <w:tcW w:type="dxa" w:w="2433"/>
           </w:tcPr>
           <w:p>
             <w:r>
@@ -919,7 +1923,7 @@
         </w:tc>
         <w:tc>
           <w:tcPr>
-            <w:tcW w:type="dxa" w:w="2160"/>
+            <w:tcW w:type="dxa" w:w="2433"/>
           </w:tcPr>
           <w:p>
             <w:r>
@@ -933,7 +1937,7 @@
         </w:tc>
         <w:tc>
           <w:tcPr>
-            <w:tcW w:type="dxa" w:w="2160"/>
+            <w:tcW w:type="dxa" w:w="2433"/>
           </w:tcPr>
           <w:p>
             <w:r>
@@ -949,7 +1953,7 @@
       <w:tr>
         <w:tc>
           <w:tcPr>
-            <w:tcW w:type="dxa" w:w="2160"/>
+            <w:tcW w:type="dxa" w:w="2433"/>
           </w:tcPr>
           <w:p>
             <w:r>
@@ -962,7 +1966,7 @@
         </w:tc>
         <w:tc>
           <w:tcPr>
-            <w:tcW w:type="dxa" w:w="2160"/>
+            <w:tcW w:type="dxa" w:w="2433"/>
           </w:tcPr>
           <w:p>
             <w:r>
@@ -975,7 +1979,7 @@
         </w:tc>
         <w:tc>
           <w:tcPr>
-            <w:tcW w:type="dxa" w:w="2160"/>
+            <w:tcW w:type="dxa" w:w="2433"/>
           </w:tcPr>
           <w:p>
             <w:r>
@@ -988,7 +1992,7 @@
         </w:tc>
         <w:tc>
           <w:tcPr>
-            <w:tcW w:type="dxa" w:w="2160"/>
+            <w:tcW w:type="dxa" w:w="2433"/>
           </w:tcPr>
           <w:p>
             <w:r>
@@ -1003,7 +2007,7 @@
       <w:tr>
         <w:tc>
           <w:tcPr>
-            <w:tcW w:type="dxa" w:w="2160"/>
+            <w:tcW w:type="dxa" w:w="2433"/>
           </w:tcPr>
           <w:p>
             <w:r>
@@ -1016,7 +2020,7 @@
         </w:tc>
         <w:tc>
           <w:tcPr>
-            <w:tcW w:type="dxa" w:w="2160"/>
+            <w:tcW w:type="dxa" w:w="2433"/>
           </w:tcPr>
           <w:p>
             <w:r>
@@ -1029,7 +2033,7 @@
         </w:tc>
         <w:tc>
           <w:tcPr>
-            <w:tcW w:type="dxa" w:w="2160"/>
+            <w:tcW w:type="dxa" w:w="2433"/>
           </w:tcPr>
           <w:p>
             <w:r>
@@ -1042,7 +2046,7 @@
         </w:tc>
         <w:tc>
           <w:tcPr>
-            <w:tcW w:type="dxa" w:w="2160"/>
+            <w:tcW w:type="dxa" w:w="2433"/>
           </w:tcPr>
           <w:p>
             <w:r>
@@ -1057,7 +2061,7 @@
       <w:tr>
         <w:tc>
           <w:tcPr>
-            <w:tcW w:type="dxa" w:w="2160"/>
+            <w:tcW w:type="dxa" w:w="2433"/>
           </w:tcPr>
           <w:p>
             <w:r>
@@ -1070,7 +2074,7 @@
         </w:tc>
         <w:tc>
           <w:tcPr>
-            <w:tcW w:type="dxa" w:w="2160"/>
+            <w:tcW w:type="dxa" w:w="2433"/>
           </w:tcPr>
           <w:p>
             <w:r>
@@ -1083,7 +2087,7 @@
         </w:tc>
         <w:tc>
           <w:tcPr>
-            <w:tcW w:type="dxa" w:w="2160"/>
+            <w:tcW w:type="dxa" w:w="2433"/>
           </w:tcPr>
           <w:p>
             <w:r>
@@ -1096,7 +2100,7 @@
         </w:tc>
         <w:tc>
           <w:tcPr>
-            <w:tcW w:type="dxa" w:w="2160"/>
+            <w:tcW w:type="dxa" w:w="2433"/>
           </w:tcPr>
           <w:p>
             <w:r>
@@ -1111,7 +2115,7 @@
       <w:tr>
         <w:tc>
           <w:tcPr>
-            <w:tcW w:type="dxa" w:w="2160"/>
+            <w:tcW w:type="dxa" w:w="2433"/>
           </w:tcPr>
           <w:p>
             <w:r>
@@ -1124,7 +2128,7 @@
         </w:tc>
         <w:tc>
           <w:tcPr>
-            <w:tcW w:type="dxa" w:w="2160"/>
+            <w:tcW w:type="dxa" w:w="2433"/>
           </w:tcPr>
           <w:p>
             <w:r>
@@ -1137,7 +2141,7 @@
         </w:tc>
         <w:tc>
           <w:tcPr>
-            <w:tcW w:type="dxa" w:w="2160"/>
+            <w:tcW w:type="dxa" w:w="2433"/>
           </w:tcPr>
           <w:p>
             <w:r>
@@ -1150,7 +2154,7 @@
         </w:tc>
         <w:tc>
           <w:tcPr>
-            <w:tcW w:type="dxa" w:w="2160"/>
+            <w:tcW w:type="dxa" w:w="2433"/>
           </w:tcPr>
           <w:p>
             <w:r>
@@ -1165,7 +2169,7 @@
       <w:tr>
         <w:tc>
           <w:tcPr>
-            <w:tcW w:type="dxa" w:w="2160"/>
+            <w:tcW w:type="dxa" w:w="2433"/>
           </w:tcPr>
           <w:p>
             <w:r>
@@ -1178,7 +2182,7 @@
         </w:tc>
         <w:tc>
           <w:tcPr>
-            <w:tcW w:type="dxa" w:w="2160"/>
+            <w:tcW w:type="dxa" w:w="2433"/>
           </w:tcPr>
           <w:p>
             <w:r>
@@ -1191,7 +2195,7 @@
         </w:tc>
         <w:tc>
           <w:tcPr>
-            <w:tcW w:type="dxa" w:w="2160"/>
+            <w:tcW w:type="dxa" w:w="2433"/>
           </w:tcPr>
           <w:p>
             <w:r>
@@ -1204,7 +2208,7 @@
         </w:tc>
         <w:tc>
           <w:tcPr>
-            <w:tcW w:type="dxa" w:w="2160"/>
+            <w:tcW w:type="dxa" w:w="2433"/>
           </w:tcPr>
           <w:p>
             <w:r>
@@ -1219,7 +2223,7 @@
       <w:tr>
         <w:tc>
           <w:tcPr>
-            <w:tcW w:type="dxa" w:w="2160"/>
+            <w:tcW w:type="dxa" w:w="2433"/>
           </w:tcPr>
           <w:p>
             <w:r>
@@ -1232,7 +2236,7 @@
         </w:tc>
         <w:tc>
           <w:tcPr>
-            <w:tcW w:type="dxa" w:w="2160"/>
+            <w:tcW w:type="dxa" w:w="2433"/>
           </w:tcPr>
           <w:p>
             <w:r>
@@ -1245,7 +2249,7 @@
         </w:tc>
         <w:tc>
           <w:tcPr>
-            <w:tcW w:type="dxa" w:w="2160"/>
+            <w:tcW w:type="dxa" w:w="2433"/>
           </w:tcPr>
           <w:p>
             <w:r>
@@ -1258,7 +2262,7 @@
         </w:tc>
         <w:tc>
           <w:tcPr>
-            <w:tcW w:type="dxa" w:w="2160"/>
+            <w:tcW w:type="dxa" w:w="2433"/>
           </w:tcPr>
           <w:p>
             <w:r>
@@ -1273,7 +2277,7 @@
       <w:tr>
         <w:tc>
           <w:tcPr>
-            <w:tcW w:type="dxa" w:w="2160"/>
+            <w:tcW w:type="dxa" w:w="2433"/>
           </w:tcPr>
           <w:p>
             <w:r>
@@ -1286,7 +2290,7 @@
         </w:tc>
         <w:tc>
           <w:tcPr>
-            <w:tcW w:type="dxa" w:w="2160"/>
+            <w:tcW w:type="dxa" w:w="2433"/>
           </w:tcPr>
           <w:p>
             <w:r>
@@ -1299,7 +2303,7 @@
         </w:tc>
         <w:tc>
           <w:tcPr>
-            <w:tcW w:type="dxa" w:w="2160"/>
+            <w:tcW w:type="dxa" w:w="2433"/>
           </w:tcPr>
           <w:p>
             <w:r>
@@ -1312,7 +2316,7 @@
         </w:tc>
         <w:tc>
           <w:tcPr>
-            <w:tcW w:type="dxa" w:w="2160"/>
+            <w:tcW w:type="dxa" w:w="2433"/>
           </w:tcPr>
           <w:p>
             <w:r>
@@ -1327,7 +2331,7 @@
       <w:tr>
         <w:tc>
           <w:tcPr>
-            <w:tcW w:type="dxa" w:w="2160"/>
+            <w:tcW w:type="dxa" w:w="2433"/>
           </w:tcPr>
           <w:p>
             <w:r>
@@ -1340,7 +2344,7 @@
         </w:tc>
         <w:tc>
           <w:tcPr>
-            <w:tcW w:type="dxa" w:w="2160"/>
+            <w:tcW w:type="dxa" w:w="2433"/>
           </w:tcPr>
           <w:p>
             <w:r>
@@ -1353,7 +2357,7 @@
         </w:tc>
         <w:tc>
           <w:tcPr>
-            <w:tcW w:type="dxa" w:w="2160"/>
+            <w:tcW w:type="dxa" w:w="2433"/>
           </w:tcPr>
           <w:p>
             <w:r>
@@ -1366,7 +2370,7 @@
         </w:tc>
         <w:tc>
           <w:tcPr>
-            <w:tcW w:type="dxa" w:w="2160"/>
+            <w:tcW w:type="dxa" w:w="2433"/>
           </w:tcPr>
           <w:p>
             <w:r>
@@ -1381,7 +2385,7 @@
       <w:tr>
         <w:tc>
           <w:tcPr>
-            <w:tcW w:type="dxa" w:w="2160"/>
+            <w:tcW w:type="dxa" w:w="2433"/>
           </w:tcPr>
           <w:p>
             <w:r>
@@ -1394,7 +2398,7 @@
         </w:tc>
         <w:tc>
           <w:tcPr>
-            <w:tcW w:type="dxa" w:w="2160"/>
+            <w:tcW w:type="dxa" w:w="2433"/>
           </w:tcPr>
           <w:p>
             <w:r>
@@ -1407,7 +2411,7 @@
         </w:tc>
         <w:tc>
           <w:tcPr>
-            <w:tcW w:type="dxa" w:w="2160"/>
+            <w:tcW w:type="dxa" w:w="2433"/>
           </w:tcPr>
           <w:p>
             <w:r>
@@ -1420,7 +2424,7 @@
         </w:tc>
         <w:tc>
           <w:tcPr>
-            <w:tcW w:type="dxa" w:w="2160"/>
+            <w:tcW w:type="dxa" w:w="2433"/>
           </w:tcPr>
           <w:p>
             <w:r>
@@ -1435,7 +2439,7 @@
       <w:tr>
         <w:tc>
           <w:tcPr>
-            <w:tcW w:type="dxa" w:w="2160"/>
+            <w:tcW w:type="dxa" w:w="2433"/>
           </w:tcPr>
           <w:p>
             <w:r>
@@ -1448,7 +2452,7 @@
         </w:tc>
         <w:tc>
           <w:tcPr>
-            <w:tcW w:type="dxa" w:w="2160"/>
+            <w:tcW w:type="dxa" w:w="2433"/>
           </w:tcPr>
           <w:p>
             <w:r>
@@ -1461,7 +2465,7 @@
         </w:tc>
         <w:tc>
           <w:tcPr>
-            <w:tcW w:type="dxa" w:w="2160"/>
+            <w:tcW w:type="dxa" w:w="2433"/>
           </w:tcPr>
           <w:p>
             <w:r>
@@ -1474,7 +2478,7 @@
         </w:tc>
         <w:tc>
           <w:tcPr>
-            <w:tcW w:type="dxa" w:w="2160"/>
+            <w:tcW w:type="dxa" w:w="2433"/>
           </w:tcPr>
           <w:p>
             <w:r>
@@ -1489,7 +2493,7 @@
       <w:tr>
         <w:tc>
           <w:tcPr>
-            <w:tcW w:type="dxa" w:w="2160"/>
+            <w:tcW w:type="dxa" w:w="2433"/>
           </w:tcPr>
           <w:p>
             <w:r>
@@ -1502,7 +2506,7 @@
         </w:tc>
         <w:tc>
           <w:tcPr>
-            <w:tcW w:type="dxa" w:w="2160"/>
+            <w:tcW w:type="dxa" w:w="2433"/>
           </w:tcPr>
           <w:p>
             <w:r>
@@ -1515,7 +2519,7 @@
         </w:tc>
         <w:tc>
           <w:tcPr>
-            <w:tcW w:type="dxa" w:w="2160"/>
+            <w:tcW w:type="dxa" w:w="2433"/>
           </w:tcPr>
           <w:p>
             <w:r>
@@ -1528,7 +2532,7 @@
         </w:tc>
         <w:tc>
           <w:tcPr>
-            <w:tcW w:type="dxa" w:w="2160"/>
+            <w:tcW w:type="dxa" w:w="2433"/>
           </w:tcPr>
           <w:p>
             <w:r>
@@ -1543,7 +2547,7 @@
       <w:tr>
         <w:tc>
           <w:tcPr>
-            <w:tcW w:type="dxa" w:w="2160"/>
+            <w:tcW w:type="dxa" w:w="2433"/>
           </w:tcPr>
           <w:p>
             <w:r>
@@ -1556,7 +2560,7 @@
         </w:tc>
         <w:tc>
           <w:tcPr>
-            <w:tcW w:type="dxa" w:w="2160"/>
+            <w:tcW w:type="dxa" w:w="2433"/>
           </w:tcPr>
           <w:p>
             <w:r>
@@ -1569,7 +2573,7 @@
         </w:tc>
         <w:tc>
           <w:tcPr>
-            <w:tcW w:type="dxa" w:w="2160"/>
+            <w:tcW w:type="dxa" w:w="2433"/>
           </w:tcPr>
           <w:p>
             <w:r>
@@ -1582,7 +2586,7 @@
         </w:tc>
         <w:tc>
           <w:tcPr>
-            <w:tcW w:type="dxa" w:w="2160"/>
+            <w:tcW w:type="dxa" w:w="2433"/>
           </w:tcPr>
           <w:p>
             <w:r>
@@ -1601,7 +2605,7 @@
         <w:drawing>
           <wp:inline xmlns:a="http://schemas.openxmlformats.org/drawingml/2006/main" xmlns:pic="http://schemas.openxmlformats.org/drawingml/2006/picture">
             <wp:extent cx="5486400" cy="3266420"/>
-            <wp:docPr id="3" name="Picture 3"/>
+            <wp:docPr id="6" name="Picture 6"/>
             <wp:cNvGraphicFramePr>
               <a:graphicFrameLocks noChangeAspect="1"/>
             </wp:cNvGraphicFramePr>
@@ -1613,7 +2617,7 @@
                     <pic:cNvPicPr/>
                   </pic:nvPicPr>
                   <pic:blipFill>
-                    <a:blip r:embed="rId11"/>
+                    <a:blip r:embed="rId14"/>
                     <a:stretch>
                       <a:fillRect/>
                     </a:stretch>
@@ -1642,7 +2646,7 @@
           <w:i/>
           <w:sz w:val="20"/>
         </w:rPr>
-        <w:t>Figure 3. Noisy crossover with 95% CI (static, zigzag, swapping).</w:t>
+        <w:t>Figure 6. Noisy crossover with 95% CI (static, zigzag, swapping).</w:t>
       </w:r>
     </w:p>
     <w:p>
@@ -1664,7 +2668,29 @@
         <w:pStyle w:val="Heading2"/>
       </w:pPr>
       <w:r>
-        <w:t>4.4 PRX reproduction (quantitative)</w:t>
+        <w:t>4.4 PRX circuit reproduction (quantitative)</w:t>
+      </w:r>
+    </w:p>
+    <w:p>
+      <w:pPr>
+        <w:spacing w:after="80"/>
+        <w:ind w:left="173"/>
+      </w:pPr>
+      <w:r>
+        <w:rPr>
+          <w:rFonts w:ascii="Times New Roman" w:hAnsi="Times New Roman"/>
+          <w:b/>
+          <w:sz w:val="19"/>
+        </w:rPr>
+        <w:t xml:space="preserve">▌ PRX reproduce — Fig. 1(a) — LRCX dynamic / unitary / postprocessing. </w:t>
+      </w:r>
+      <w:r>
+        <w:rPr>
+          <w:rFonts w:ascii="Times New Roman" w:hAnsi="Times New Roman"/>
+          <w:i/>
+          <w:sz w:val="19"/>
+        </w:rPr>
+        <w:t>Table 5: minimum Bell fidelity over measurement branches (statevector simulation).</w:t>
       </w:r>
     </w:p>
     <w:p>
@@ -1676,7 +2702,7 @@
           <w:i/>
           <w:sz w:val="20"/>
         </w:rPr>
-        <w:t>Table 4. LRCX Bell fidelity (statevector, min over measurement branches).</w:t>
+        <w:t>Table 5. LRCX Bell fidelity (statevector, min over measurement branches) — PRX Fig. 1(a).</w:t>
       </w:r>
     </w:p>
     <w:tbl>
@@ -1687,14 +2713,14 @@
         <w:tblLook w:firstColumn="1" w:firstRow="1" w:lastColumn="0" w:lastRow="0" w:noHBand="0" w:noVBand="1" w:val="04A0"/>
       </w:tblPr>
       <w:tblGrid>
-        <w:gridCol w:w="2880"/>
-        <w:gridCol w:w="2880"/>
-        <w:gridCol w:w="2880"/>
+        <w:gridCol w:w="3245"/>
+        <w:gridCol w:w="3245"/>
+        <w:gridCol w:w="3245"/>
       </w:tblGrid>
       <w:tr>
         <w:tc>
           <w:tcPr>
-            <w:tcW w:type="dxa" w:w="2880"/>
+            <w:tcW w:type="dxa" w:w="3245"/>
           </w:tcPr>
           <w:p>
             <w:r>
@@ -1708,7 +2734,7 @@
         </w:tc>
         <w:tc>
           <w:tcPr>
-            <w:tcW w:type="dxa" w:w="2880"/>
+            <w:tcW w:type="dxa" w:w="3245"/>
           </w:tcPr>
           <w:p>
             <w:r>
@@ -1722,7 +2748,7 @@
         </w:tc>
         <w:tc>
           <w:tcPr>
-            <w:tcW w:type="dxa" w:w="2880"/>
+            <w:tcW w:type="dxa" w:w="3245"/>
           </w:tcPr>
           <w:p>
             <w:r>
@@ -1738,7 +2764,7 @@
       <w:tr>
         <w:tc>
           <w:tcPr>
-            <w:tcW w:type="dxa" w:w="2880"/>
+            <w:tcW w:type="dxa" w:w="3245"/>
           </w:tcPr>
           <w:p>
             <w:r>
@@ -1751,7 +2777,7 @@
         </w:tc>
         <w:tc>
           <w:tcPr>
-            <w:tcW w:type="dxa" w:w="2880"/>
+            <w:tcW w:type="dxa" w:w="3245"/>
           </w:tcPr>
           <w:p>
             <w:r>
@@ -1764,7 +2790,7 @@
         </w:tc>
         <w:tc>
           <w:tcPr>
-            <w:tcW w:type="dxa" w:w="2880"/>
+            <w:tcW w:type="dxa" w:w="3245"/>
           </w:tcPr>
           <w:p>
             <w:r>
@@ -1779,7 +2805,7 @@
       <w:tr>
         <w:tc>
           <w:tcPr>
-            <w:tcW w:type="dxa" w:w="2880"/>
+            <w:tcW w:type="dxa" w:w="3245"/>
           </w:tcPr>
           <w:p>
             <w:r>
@@ -1792,7 +2818,7 @@
         </w:tc>
         <w:tc>
           <w:tcPr>
-            <w:tcW w:type="dxa" w:w="2880"/>
+            <w:tcW w:type="dxa" w:w="3245"/>
           </w:tcPr>
           <w:p>
             <w:r>
@@ -1805,7 +2831,7 @@
         </w:tc>
         <w:tc>
           <w:tcPr>
-            <w:tcW w:type="dxa" w:w="2880"/>
+            <w:tcW w:type="dxa" w:w="3245"/>
           </w:tcPr>
           <w:p>
             <w:r>
@@ -1820,7 +2846,7 @@
       <w:tr>
         <w:tc>
           <w:tcPr>
-            <w:tcW w:type="dxa" w:w="2880"/>
+            <w:tcW w:type="dxa" w:w="3245"/>
           </w:tcPr>
           <w:p>
             <w:r>
@@ -1833,7 +2859,7 @@
         </w:tc>
         <w:tc>
           <w:tcPr>
-            <w:tcW w:type="dxa" w:w="2880"/>
+            <w:tcW w:type="dxa" w:w="3245"/>
           </w:tcPr>
           <w:p>
             <w:r>
@@ -1846,7 +2872,7 @@
         </w:tc>
         <w:tc>
           <w:tcPr>
-            <w:tcW w:type="dxa" w:w="2880"/>
+            <w:tcW w:type="dxa" w:w="3245"/>
           </w:tcPr>
           <w:p>
             <w:r>
@@ -1861,7 +2887,7 @@
       <w:tr>
         <w:tc>
           <w:tcPr>
-            <w:tcW w:type="dxa" w:w="2880"/>
+            <w:tcW w:type="dxa" w:w="3245"/>
           </w:tcPr>
           <w:p>
             <w:r>
@@ -1874,7 +2900,7 @@
         </w:tc>
         <w:tc>
           <w:tcPr>
-            <w:tcW w:type="dxa" w:w="2880"/>
+            <w:tcW w:type="dxa" w:w="3245"/>
           </w:tcPr>
           <w:p>
             <w:r>
@@ -1887,7 +2913,7 @@
         </w:tc>
         <w:tc>
           <w:tcPr>
-            <w:tcW w:type="dxa" w:w="2880"/>
+            <w:tcW w:type="dxa" w:w="3245"/>
           </w:tcPr>
           <w:p>
             <w:r>
@@ -1902,7 +2928,7 @@
       <w:tr>
         <w:tc>
           <w:tcPr>
-            <w:tcW w:type="dxa" w:w="2880"/>
+            <w:tcW w:type="dxa" w:w="3245"/>
           </w:tcPr>
           <w:p>
             <w:r>
@@ -1915,7 +2941,7 @@
         </w:tc>
         <w:tc>
           <w:tcPr>
-            <w:tcW w:type="dxa" w:w="2880"/>
+            <w:tcW w:type="dxa" w:w="3245"/>
           </w:tcPr>
           <w:p>
             <w:r>
@@ -1928,7 +2954,7 @@
         </w:tc>
         <w:tc>
           <w:tcPr>
-            <w:tcW w:type="dxa" w:w="2880"/>
+            <w:tcW w:type="dxa" w:w="3245"/>
           </w:tcPr>
           <w:p>
             <w:r>
@@ -1944,6 +2970,28 @@
     <w:p/>
     <w:p>
       <w:pPr>
+        <w:spacing w:after="80"/>
+        <w:ind w:left="173"/>
+      </w:pPr>
+      <w:r>
+        <w:rPr>
+          <w:rFonts w:ascii="Times New Roman" w:hAnsi="Times New Roman"/>
+          <w:b/>
+          <w:sz w:val="19"/>
+        </w:rPr>
+        <w:t xml:space="preserve">▌ PRX reproduce — Fig. 2(b) — unitary vs dynamic GHZ preparation. </w:t>
+      </w:r>
+      <w:r>
+        <w:rPr>
+          <w:rFonts w:ascii="Times New Roman" w:hAnsi="Times New Roman"/>
+          <w:i/>
+          <w:sz w:val="19"/>
+        </w:rPr>
+        <w:t>Table 6: GHZ stabilizer fidelity from rebuilt circuits.</w:t>
+      </w:r>
+    </w:p>
+    <w:p>
+      <w:pPr>
         <w:spacing w:after="120"/>
       </w:pPr>
       <w:r>
@@ -1951,7 +2999,7 @@
           <w:i/>
           <w:sz w:val="20"/>
         </w:rPr>
-        <w:t>Table 5. GHZ preparation fidelity.</w:t>
+        <w:t>Table 6. GHZ preparation fidelity — PRX Fig. 2(b).</w:t>
       </w:r>
     </w:p>
     <w:tbl>
@@ -1962,14 +3010,14 @@
         <w:tblLook w:firstColumn="1" w:firstRow="1" w:lastColumn="0" w:lastRow="0" w:noHBand="0" w:noVBand="1" w:val="04A0"/>
       </w:tblPr>
       <w:tblGrid>
-        <w:gridCol w:w="2880"/>
-        <w:gridCol w:w="2880"/>
-        <w:gridCol w:w="2880"/>
+        <w:gridCol w:w="3245"/>
+        <w:gridCol w:w="3245"/>
+        <w:gridCol w:w="3245"/>
       </w:tblGrid>
       <w:tr>
         <w:tc>
           <w:tcPr>
-            <w:tcW w:type="dxa" w:w="2880"/>
+            <w:tcW w:type="dxa" w:w="3245"/>
           </w:tcPr>
           <w:p>
             <w:r>
@@ -1983,7 +3031,7 @@
         </w:tc>
         <w:tc>
           <w:tcPr>
-            <w:tcW w:type="dxa" w:w="2880"/>
+            <w:tcW w:type="dxa" w:w="3245"/>
           </w:tcPr>
           <w:p>
             <w:r>
@@ -1997,7 +3045,7 @@
         </w:tc>
         <w:tc>
           <w:tcPr>
-            <w:tcW w:type="dxa" w:w="2880"/>
+            <w:tcW w:type="dxa" w:w="3245"/>
           </w:tcPr>
           <w:p>
             <w:r>
@@ -2013,7 +3061,7 @@
       <w:tr>
         <w:tc>
           <w:tcPr>
-            <w:tcW w:type="dxa" w:w="2880"/>
+            <w:tcW w:type="dxa" w:w="3245"/>
           </w:tcPr>
           <w:p>
             <w:r>
@@ -2026,7 +3074,7 @@
         </w:tc>
         <w:tc>
           <w:tcPr>
-            <w:tcW w:type="dxa" w:w="2880"/>
+            <w:tcW w:type="dxa" w:w="3245"/>
           </w:tcPr>
           <w:p>
             <w:r>
@@ -2039,7 +3087,7 @@
         </w:tc>
         <w:tc>
           <w:tcPr>
-            <w:tcW w:type="dxa" w:w="2880"/>
+            <w:tcW w:type="dxa" w:w="3245"/>
           </w:tcPr>
           <w:p>
             <w:r>
@@ -2054,7 +3102,7 @@
       <w:tr>
         <w:tc>
           <w:tcPr>
-            <w:tcW w:type="dxa" w:w="2880"/>
+            <w:tcW w:type="dxa" w:w="3245"/>
           </w:tcPr>
           <w:p>
             <w:r>
@@ -2067,7 +3115,7 @@
         </w:tc>
         <w:tc>
           <w:tcPr>
-            <w:tcW w:type="dxa" w:w="2880"/>
+            <w:tcW w:type="dxa" w:w="3245"/>
           </w:tcPr>
           <w:p>
             <w:r>
@@ -2080,7 +3128,7 @@
         </w:tc>
         <w:tc>
           <w:tcPr>
-            <w:tcW w:type="dxa" w:w="2880"/>
+            <w:tcW w:type="dxa" w:w="3245"/>
           </w:tcPr>
           <w:p>
             <w:r>
@@ -2095,7 +3143,7 @@
       <w:tr>
         <w:tc>
           <w:tcPr>
-            <w:tcW w:type="dxa" w:w="2880"/>
+            <w:tcW w:type="dxa" w:w="3245"/>
           </w:tcPr>
           <w:p>
             <w:r>
@@ -2108,7 +3156,7 @@
         </w:tc>
         <w:tc>
           <w:tcPr>
-            <w:tcW w:type="dxa" w:w="2880"/>
+            <w:tcW w:type="dxa" w:w="3245"/>
           </w:tcPr>
           <w:p>
             <w:r>
@@ -2121,7 +3169,7 @@
         </w:tc>
         <w:tc>
           <w:tcPr>
-            <w:tcW w:type="dxa" w:w="2880"/>
+            <w:tcW w:type="dxa" w:w="3245"/>
           </w:tcPr>
           <w:p>
             <w:r>
@@ -2136,7 +3184,7 @@
       <w:tr>
         <w:tc>
           <w:tcPr>
-            <w:tcW w:type="dxa" w:w="2880"/>
+            <w:tcW w:type="dxa" w:w="3245"/>
           </w:tcPr>
           <w:p>
             <w:r>
@@ -2149,7 +3197,7 @@
         </w:tc>
         <w:tc>
           <w:tcPr>
-            <w:tcW w:type="dxa" w:w="2880"/>
+            <w:tcW w:type="dxa" w:w="3245"/>
           </w:tcPr>
           <w:p>
             <w:r>
@@ -2162,7 +3210,7 @@
         </w:tc>
         <w:tc>
           <w:tcPr>
-            <w:tcW w:type="dxa" w:w="2880"/>
+            <w:tcW w:type="dxa" w:w="3245"/>
           </w:tcPr>
           <w:p>
             <w:r>
@@ -2177,7 +3225,7 @@
       <w:tr>
         <w:tc>
           <w:tcPr>
-            <w:tcW w:type="dxa" w:w="2880"/>
+            <w:tcW w:type="dxa" w:w="3245"/>
           </w:tcPr>
           <w:p>
             <w:r>
@@ -2190,7 +3238,7 @@
         </w:tc>
         <w:tc>
           <w:tcPr>
-            <w:tcW w:type="dxa" w:w="2880"/>
+            <w:tcW w:type="dxa" w:w="3245"/>
           </w:tcPr>
           <w:p>
             <w:r>
@@ -2203,7 +3251,7 @@
         </w:tc>
         <w:tc>
           <w:tcPr>
-            <w:tcW w:type="dxa" w:w="2880"/>
+            <w:tcW w:type="dxa" w:w="3245"/>
           </w:tcPr>
           <w:p>
             <w:r>
@@ -2218,7 +3266,7 @@
       <w:tr>
         <w:tc>
           <w:tcPr>
-            <w:tcW w:type="dxa" w:w="2880"/>
+            <w:tcW w:type="dxa" w:w="3245"/>
           </w:tcPr>
           <w:p>
             <w:r>
@@ -2231,7 +3279,7 @@
         </w:tc>
         <w:tc>
           <w:tcPr>
-            <w:tcW w:type="dxa" w:w="2880"/>
+            <w:tcW w:type="dxa" w:w="3245"/>
           </w:tcPr>
           <w:p>
             <w:r>
@@ -2244,7 +3292,7 @@
         </w:tc>
         <w:tc>
           <w:tcPr>
-            <w:tcW w:type="dxa" w:w="2880"/>
+            <w:tcW w:type="dxa" w:w="3245"/>
           </w:tcPr>
           <w:p>
             <w:r>
@@ -2263,21 +3311,29 @@
         <w:pStyle w:val="Heading2"/>
       </w:pPr>
       <w:r>
-        <w:t>4.5 Error-budget analysis (qualitative)</w:t>
+        <w:t>4.5 Error-budget analysis (PRX Appendix B.2)</w:t>
       </w:r>
     </w:p>
     <w:p>
       <w:pPr>
-        <w:spacing w:after="120"/>
-        <w:jc w:val="both"/>
+        <w:spacing w:after="80"/>
+        <w:ind w:left="173"/>
       </w:pPr>
       <w:r>
         <w:rPr>
-          <w:b w:val="0"/>
-          <w:i w:val="0"/>
-          <w:sz w:val="22"/>
+          <w:rFonts w:ascii="Times New Roman" w:hAnsi="Times New Roman"/>
+          <w:b/>
+          <w:sz w:val="19"/>
         </w:rPr>
-        <w:t>Using Bäumer et al. Appendix B.2 parameters (μ≈3.65, λ_idle=0.03, λ_CNOT=0.02, λ_meas=0.03), F_proc ≥ exp(−λ_tot). These bounds use paper calibration—not our Aer model. Panels are split by task.</w:t>
+        <w:t xml:space="preserve">▌ PRX reproduce — Appendix B.2 — λ_tot = t_idle λ_idle + N_CNOT λ_CNOT + N_meas λ_meas. </w:t>
+      </w:r>
+      <w:r>
+        <w:rPr>
+          <w:rFonts w:ascii="Times New Roman" w:hAnsi="Times New Roman"/>
+          <w:i/>
+          <w:sz w:val="19"/>
+        </w:rPr>
+        <w:t>We apply the paper's μ≈3.65, λ_idle=0.03, λ_CNOT=0.02, λ_meas=0.03 separately to Bell prep and LRCX tasks. These bounds use paper calibration — not our Aer model. Qualitative trend mapping only.</w:t>
       </w:r>
     </w:p>
     <w:p>
@@ -2285,7 +3341,7 @@
         <w:drawing>
           <wp:inline xmlns:a="http://schemas.openxmlformats.org/drawingml/2006/main" xmlns:pic="http://schemas.openxmlformats.org/drawingml/2006/picture">
             <wp:extent cx="5486400" cy="3073555"/>
-            <wp:docPr id="4" name="Picture 4"/>
+            <wp:docPr id="7" name="Picture 7"/>
             <wp:cNvGraphicFramePr>
               <a:graphicFrameLocks noChangeAspect="1"/>
             </wp:cNvGraphicFramePr>
@@ -2297,7 +3353,7 @@
                     <pic:cNvPicPr/>
                   </pic:nvPicPr>
                   <pic:blipFill>
-                    <a:blip r:embed="rId12"/>
+                    <a:blip r:embed="rId15"/>
                     <a:stretch>
                       <a:fillRect/>
                     </a:stretch>
@@ -2326,7 +3382,7 @@
           <w:i/>
           <w:sz w:val="20"/>
         </w:rPr>
-        <w:t>Figure 4. Error budget: Bell-state preparation tasks.</w:t>
+        <w:t>Figure 7. Error budget: Bell-state preparation tasks (Appendix B.2 mapping).</w:t>
       </w:r>
     </w:p>
     <w:p>
@@ -2334,7 +3390,7 @@
         <w:drawing>
           <wp:inline xmlns:a="http://schemas.openxmlformats.org/drawingml/2006/main" xmlns:pic="http://schemas.openxmlformats.org/drawingml/2006/picture">
             <wp:extent cx="5486400" cy="3073555"/>
-            <wp:docPr id="5" name="Picture 5"/>
+            <wp:docPr id="8" name="Picture 8"/>
             <wp:cNvGraphicFramePr>
               <a:graphicFrameLocks noChangeAspect="1"/>
             </wp:cNvGraphicFramePr>
@@ -2346,7 +3402,7 @@
                     <pic:cNvPicPr/>
                   </pic:nvPicPr>
                   <pic:blipFill>
-                    <a:blip r:embed="rId13"/>
+                    <a:blip r:embed="rId16"/>
                     <a:stretch>
                       <a:fillRect/>
                     </a:stretch>
@@ -2375,7 +3431,7 @@
           <w:i/>
           <w:sz w:val="20"/>
         </w:rPr>
-        <w:t>Figure 5. Error budget: long-range CNOT teleportation.</w:t>
+        <w:t>Figure 8. Error budget: long-range CNOT teleportation (Appendix B.2 mapping).</w:t>
       </w:r>
     </w:p>
     <w:p>
@@ -2387,11 +3443,33 @@
       </w:r>
     </w:p>
     <w:p>
+      <w:pPr>
+        <w:spacing w:after="80"/>
+        <w:ind w:left="173"/>
+      </w:pPr>
+      <w:r>
+        <w:rPr>
+          <w:rFonts w:ascii="Times New Roman" w:hAnsi="Times New Roman"/>
+          <w:b/>
+          <w:sz w:val="19"/>
+        </w:rPr>
+        <w:t xml:space="preserve">▌ PRX qualitative analogy — Fig. 2(b) left — unitary GHZ chain. </w:t>
+      </w:r>
+      <w:r>
+        <w:rPr>
+          <w:rFonts w:ascii="Times New Roman" w:hAnsi="Times New Roman"/>
+          <w:i/>
+          <w:sz w:val="19"/>
+        </w:rPr>
+        <w:t>Strategy A static chain at L=5.</w:t>
+      </w:r>
+    </w:p>
+    <w:p>
       <w:r>
         <w:drawing>
           <wp:inline xmlns:a="http://schemas.openxmlformats.org/drawingml/2006/main" xmlns:pic="http://schemas.openxmlformats.org/drawingml/2006/picture">
             <wp:extent cx="5760720" cy="3727914"/>
-            <wp:docPr id="6" name="Picture 6"/>
+            <wp:docPr id="9" name="Picture 9"/>
             <wp:cNvGraphicFramePr>
               <a:graphicFrameLocks noChangeAspect="1"/>
             </wp:cNvGraphicFramePr>
@@ -2403,7 +3481,7 @@
                     <pic:cNvPicPr/>
                   </pic:nvPicPr>
                   <pic:blipFill>
-                    <a:blip r:embed="rId14"/>
+                    <a:blip r:embed="rId17"/>
                     <a:stretch>
                       <a:fillRect/>
                     </a:stretch>
@@ -2432,7 +3510,29 @@
           <w:i/>
           <w:sz w:val="20"/>
         </w:rPr>
-        <w:t>Figure 6. Static chain (L=5).</w:t>
+        <w:t>Figure 9. Static chain (L=5).</w:t>
+      </w:r>
+    </w:p>
+    <w:p>
+      <w:pPr>
+        <w:spacing w:after="80"/>
+        <w:ind w:left="173"/>
+      </w:pPr>
+      <w:r>
+        <w:rPr>
+          <w:rFonts w:ascii="Times New Roman" w:hAnsi="Times New Roman"/>
+          <w:b/>
+          <w:sz w:val="19"/>
+        </w:rPr>
+        <w:t xml:space="preserve">▌ PRX mechanism (imitation) — Fig. 1(a) — Bell meas. + feed-forward. </w:t>
+      </w:r>
+      <w:r>
+        <w:rPr>
+          <w:rFonts w:ascii="Times New Roman" w:hAnsi="Times New Roman"/>
+          <w:i/>
+          <w:sz w:val="19"/>
+        </w:rPr>
+        <w:t>Strategy B swapping at L=3.</w:t>
       </w:r>
     </w:p>
     <w:p>
@@ -2440,7 +3540,7 @@
         <w:drawing>
           <wp:inline xmlns:a="http://schemas.openxmlformats.org/drawingml/2006/main" xmlns:pic="http://schemas.openxmlformats.org/drawingml/2006/picture">
             <wp:extent cx="5760720" cy="3306101"/>
-            <wp:docPr id="7" name="Picture 7"/>
+            <wp:docPr id="10" name="Picture 10"/>
             <wp:cNvGraphicFramePr>
               <a:graphicFrameLocks noChangeAspect="1"/>
             </wp:cNvGraphicFramePr>
@@ -2452,7 +3552,7 @@
                     <pic:cNvPicPr/>
                   </pic:nvPicPr>
                   <pic:blipFill>
-                    <a:blip r:embed="rId15"/>
+                    <a:blip r:embed="rId18"/>
                     <a:stretch>
                       <a:fillRect/>
                     </a:stretch>
@@ -2481,7 +3581,7 @@
           <w:i/>
           <w:sz w:val="20"/>
         </w:rPr>
-        <w:t>Figure 7. Swapping (L=3).</w:t>
+        <w:t>Figure 10. Entanglement swapping (L=3).</w:t>
       </w:r>
     </w:p>
     <w:p>
@@ -2490,7 +3590,7 @@
           <w:b/>
           <w:sz w:val="20"/>
         </w:rPr>
-        <w:t>Listing 2. Reproduction.</w:t>
+        <w:t>Listing 2. Full reproduction.</w:t>
       </w:r>
     </w:p>
     <w:p>
@@ -2542,7 +3642,7 @@
           <w:rFonts w:ascii="Courier New" w:hAnsi="Courier New"/>
           <w:sz w:val="17"/>
         </w:rPr>
-        <w:t>python3 scripts/build_graduate_package.py</w:t>
+        <w:t>python3 scripts/reproduce.py</w:t>
       </w:r>
     </w:p>
     <w:p/>
@@ -2559,7 +3659,7 @@
         <w:pStyle w:val="ListNumber"/>
       </w:pPr>
       <w:r>
-        <w:t>Simulation uses Qiskit Aer; PRX Quantum reports 101-qubit IBM hardware.</w:t>
+        <w:t>Ephys ladder Bell preparation is our original competition scope; PRX sections are reproduced or mapped as in Table 1.</w:t>
       </w:r>
     </w:p>
     <w:p>
@@ -2567,7 +3667,7 @@
         <w:pStyle w:val="ListNumber"/>
       </w:pPr>
       <w:r>
-        <w:t>Error-budget curves and P(00)+P(11) use different noise calibrations—compare trends only.</w:t>
+        <w:t>Simulation uses Qiskit Aer; PRX Quantum reports 101-qubit IBM hardware — do not equate absolute fidelities.</w:t>
       </w:r>
     </w:p>
     <w:p>
@@ -2575,7 +3675,7 @@
         <w:pStyle w:val="ListNumber"/>
       </w:pPr>
       <w:r>
-        <w:t>Bell-state preparation ≠ gate teleportation; tasks are related but not identical.</w:t>
+        <w:t>Error-budget curves (Appendix B.2) and P(00)+P(11) (Aer) use different calibrations — compare trends only.</w:t>
       </w:r>
     </w:p>
     <w:p>
@@ -2583,7 +3683,15 @@
         <w:pStyle w:val="ListNumber"/>
       </w:pPr>
       <w:r>
-        <w:t>Classical decode approximates feed-forward for fair noisy comparison.</w:t>
+        <w:t>Bell-state preparation ≠ LRCX gate teleportation; related via Bell measurement but distinct tasks.</w:t>
+      </w:r>
+    </w:p>
+    <w:p>
+      <w:pPr>
+        <w:pStyle w:val="ListNumber"/>
+      </w:pPr>
+      <w:r>
+        <w:t>Classical decode approximates feed-forward for fair noisy Ephys comparison.</w:t>
       </w:r>
     </w:p>
     <w:p>
@@ -2605,7 +3713,7 @@
           <w:i w:val="0"/>
           <w:sz w:val="22"/>
         </w:rPr>
-        <w:t>We provide reproducible ladder-topology Bell preparation, PRX circuit reproduction with quantitative fidelities, and a carefully scoped crossover analysis separating simulation from paper error budgets.</w:t>
+        <w:t>We deliver a competition-format ladder Bell report extended with an explicit PRX Quantum 5.030339 map: circuits in Fig. 1(a) and Fig. 2(b) are reproduced with pytest; Appendix B.2 error budgets and Section III crossover phenomena are mapped qualitatively to our Ephys simulations.</w:t>
       </w:r>
     </w:p>
     <w:p>
@@ -2653,7 +3761,7 @@
       </w:r>
     </w:p>
     <w:p>
-      <w:hyperlink r:id="rId16">
+      <w:hyperlink r:id="rId19">
         <w:r>
           <w:rPr>
             <w:color w:val="0563C1"/>
@@ -2674,7 +3782,7 @@
           <w:i w:val="0"/>
           <w:sz w:val="22"/>
         </w:rPr>
-        <w:t>Reproduction reference commit: beece71</w:t>
+        <w:t>Reproduction reference commit: b2fc18e</w:t>
       </w:r>
     </w:p>
     <w:p>
@@ -2701,7 +3809,7 @@
     </w:p>
     <w:p>
       <w:r>
-        <w:t>[1] E. Bäumer et al., PRX Quantum 5, 030339 (2024). https://doi.org/10.1103/PRXQuantum.5.030339</w:t>
+        <w:t>[1] E. Bäumer et al., Efficient Long-Range Entanglement Using Dynamic Circuits, PRX Quantum 5, 030339 (2024). https://doi.org/10.1103/PRXQuantum.5.030339</w:t>
       </w:r>
     </w:p>
     <w:p>
@@ -2712,6 +3820,11 @@
     <w:p>
       <w:r>
         <w:t>[3] Ephys Challenge 2026, National Chengchi University.</w:t>
+      </w:r>
+    </w:p>
+    <w:p>
+      <w:r>
+        <w:t>[4] M. A. Nielsen and I. L. Chuang, Quantum Computation and Quantum Information, Cambridge University Press.</w:t>
       </w:r>
     </w:p>
     <w:p>
@@ -2747,14 +3860,15 @@
         <w:tblLook w:firstColumn="1" w:firstRow="1" w:lastColumn="0" w:lastRow="0" w:noHBand="0" w:noVBand="1" w:val="04A0"/>
       </w:tblPr>
       <w:tblGrid>
-        <w:gridCol w:w="2880"/>
-        <w:gridCol w:w="2880"/>
-        <w:gridCol w:w="2880"/>
+        <w:gridCol w:w="2433"/>
+        <w:gridCol w:w="2433"/>
+        <w:gridCol w:w="2433"/>
+        <w:gridCol w:w="2433"/>
       </w:tblGrid>
       <w:tr>
         <w:tc>
           <w:tcPr>
-            <w:tcW w:type="dxa" w:w="2880"/>
+            <w:tcW w:type="dxa" w:w="2433"/>
           </w:tcPr>
           <w:p>
             <w:r>
@@ -2768,7 +3882,7 @@
         </w:tc>
         <w:tc>
           <w:tcPr>
-            <w:tcW w:type="dxa" w:w="2880"/>
+            <w:tcW w:type="dxa" w:w="2433"/>
           </w:tcPr>
           <w:p>
             <w:r>
@@ -2782,7 +3896,7 @@
         </w:tc>
         <w:tc>
           <w:tcPr>
-            <w:tcW w:type="dxa" w:w="2880"/>
+            <w:tcW w:type="dxa" w:w="2433"/>
           </w:tcPr>
           <w:p>
             <w:r>
@@ -2794,24 +3908,92 @@
             </w:r>
           </w:p>
         </w:tc>
+        <w:tc>
+          <w:tcPr>
+            <w:tcW w:type="dxa" w:w="2433"/>
+          </w:tcPr>
+          <w:p>
+            <w:r>
+              <w:rPr>
+                <w:b/>
+                <w:sz w:val="18"/>
+              </w:rPr>
+              <w:t>PRX link</w:t>
+            </w:r>
+          </w:p>
+        </w:tc>
       </w:tr>
       <w:tr>
         <w:tc>
           <w:tcPr>
-            <w:tcW w:type="dxa" w:w="2880"/>
+            <w:tcW w:type="dxa" w:w="2433"/>
           </w:tcPr>
           <w:p>
             <w:r>
               <w:rPr>
                 <w:sz w:val="18"/>
               </w:rPr>
-              <w:t>1</w:t>
+              <w:t>1–3</w:t>
             </w:r>
           </w:p>
         </w:tc>
         <w:tc>
           <w:tcPr>
-            <w:tcW w:type="dxa" w:w="2880"/>
+            <w:tcW w:type="dxa" w:w="2433"/>
+          </w:tcPr>
+          <w:p>
+            <w:r>
+              <w:rPr>
+                <w:sz w:val="18"/>
+              </w:rPr>
+              <w:t>figure_topology_*.png</w:t>
+            </w:r>
+          </w:p>
+        </w:tc>
+        <w:tc>
+          <w:tcPr>
+            <w:tcW w:type="dxa" w:w="2433"/>
+          </w:tcPr>
+          <w:p>
+            <w:r>
+              <w:rPr>
+                <w:sz w:val="18"/>
+              </w:rPr>
+              <w:t>scripts/generate_word_reports.py</w:t>
+            </w:r>
+          </w:p>
+        </w:tc>
+        <w:tc>
+          <w:tcPr>
+            <w:tcW w:type="dxa" w:w="2433"/>
+          </w:tcPr>
+          <w:p>
+            <w:r>
+              <w:rPr>
+                <w:sz w:val="18"/>
+              </w:rPr>
+              <w:t>— (Ephys topology)</w:t>
+            </w:r>
+          </w:p>
+        </w:tc>
+      </w:tr>
+      <w:tr>
+        <w:tc>
+          <w:tcPr>
+            <w:tcW w:type="dxa" w:w="2433"/>
+          </w:tcPr>
+          <w:p>
+            <w:r>
+              <w:rPr>
+                <w:sz w:val="18"/>
+              </w:rPr>
+              <w:t>4</w:t>
+            </w:r>
+          </w:p>
+        </w:tc>
+        <w:tc>
+          <w:tcPr>
+            <w:tcW w:type="dxa" w:w="2433"/>
           </w:tcPr>
           <w:p>
             <w:r>
@@ -2824,7 +4006,7 @@
         </w:tc>
         <w:tc>
           <w:tcPr>
-            <w:tcW w:type="dxa" w:w="2880"/>
+            <w:tcW w:type="dxa" w:w="2433"/>
           </w:tcPr>
           <w:p>
             <w:r>
@@ -2835,24 +4017,37 @@
             </w:r>
           </w:p>
         </w:tc>
-      </w:tr>
-      <w:tr>
         <w:tc>
           <w:tcPr>
-            <w:tcW w:type="dxa" w:w="2880"/>
+            <w:tcW w:type="dxa" w:w="2433"/>
           </w:tcPr>
           <w:p>
             <w:r>
               <w:rPr>
                 <w:sz w:val="18"/>
               </w:rPr>
-              <w:t>2</w:t>
+              <w:t>Fig. 2(c) analogy</w:t>
+            </w:r>
+          </w:p>
+        </w:tc>
+      </w:tr>
+      <w:tr>
+        <w:tc>
+          <w:tcPr>
+            <w:tcW w:type="dxa" w:w="2433"/>
+          </w:tcPr>
+          <w:p>
+            <w:r>
+              <w:rPr>
+                <w:sz w:val="18"/>
+              </w:rPr>
+              <w:t>5</w:t>
             </w:r>
           </w:p>
         </w:tc>
         <w:tc>
           <w:tcPr>
-            <w:tcW w:type="dxa" w:w="2880"/>
+            <w:tcW w:type="dxa" w:w="2433"/>
           </w:tcPr>
           <w:p>
             <w:r>
@@ -2865,7 +4060,7 @@
         </w:tc>
         <w:tc>
           <w:tcPr>
-            <w:tcW w:type="dxa" w:w="2880"/>
+            <w:tcW w:type="dxa" w:w="2433"/>
           </w:tcPr>
           <w:p>
             <w:r>
@@ -2876,24 +4071,37 @@
             </w:r>
           </w:p>
         </w:tc>
-      </w:tr>
-      <w:tr>
         <w:tc>
           <w:tcPr>
-            <w:tcW w:type="dxa" w:w="2880"/>
+            <w:tcW w:type="dxa" w:w="2433"/>
           </w:tcPr>
           <w:p>
             <w:r>
               <w:rPr>
                 <w:sz w:val="18"/>
               </w:rPr>
-              <w:t>3</w:t>
+              <w:t>—</w:t>
+            </w:r>
+          </w:p>
+        </w:tc>
+      </w:tr>
+      <w:tr>
+        <w:tc>
+          <w:tcPr>
+            <w:tcW w:type="dxa" w:w="2433"/>
+          </w:tcPr>
+          <w:p>
+            <w:r>
+              <w:rPr>
+                <w:sz w:val="18"/>
+              </w:rPr>
+              <w:t>6</w:t>
             </w:r>
           </w:p>
         </w:tc>
         <w:tc>
           <w:tcPr>
-            <w:tcW w:type="dxa" w:w="2880"/>
+            <w:tcW w:type="dxa" w:w="2433"/>
           </w:tcPr>
           <w:p>
             <w:r>
@@ -2906,7 +4114,7 @@
         </w:tc>
         <w:tc>
           <w:tcPr>
-            <w:tcW w:type="dxa" w:w="2880"/>
+            <w:tcW w:type="dxa" w:w="2433"/>
           </w:tcPr>
           <w:p>
             <w:r>
@@ -2917,24 +4125,37 @@
             </w:r>
           </w:p>
         </w:tc>
-      </w:tr>
-      <w:tr>
         <w:tc>
           <w:tcPr>
-            <w:tcW w:type="dxa" w:w="2880"/>
+            <w:tcW w:type="dxa" w:w="2433"/>
           </w:tcPr>
           <w:p>
             <w:r>
               <w:rPr>
                 <w:sz w:val="18"/>
               </w:rPr>
-              <w:t>4–5</w:t>
+              <w:t>Sec. III analogy</w:t>
+            </w:r>
+          </w:p>
+        </w:tc>
+      </w:tr>
+      <w:tr>
+        <w:tc>
+          <w:tcPr>
+            <w:tcW w:type="dxa" w:w="2433"/>
+          </w:tcPr>
+          <w:p>
+            <w:r>
+              <w:rPr>
+                <w:sz w:val="18"/>
+              </w:rPr>
+              <w:t>7–8</w:t>
             </w:r>
           </w:p>
         </w:tc>
         <w:tc>
           <w:tcPr>
-            <w:tcW w:type="dxa" w:w="2880"/>
+            <w:tcW w:type="dxa" w:w="2433"/>
           </w:tcPr>
           <w:p>
             <w:r>
@@ -2947,7 +4168,7 @@
         </w:tc>
         <w:tc>
           <w:tcPr>
-            <w:tcW w:type="dxa" w:w="2880"/>
+            <w:tcW w:type="dxa" w:w="2433"/>
           </w:tcPr>
           <w:p>
             <w:r>
@@ -2958,24 +4179,37 @@
             </w:r>
           </w:p>
         </w:tc>
-      </w:tr>
-      <w:tr>
         <w:tc>
           <w:tcPr>
-            <w:tcW w:type="dxa" w:w="2880"/>
+            <w:tcW w:type="dxa" w:w="2433"/>
           </w:tcPr>
           <w:p>
             <w:r>
               <w:rPr>
                 <w:sz w:val="18"/>
               </w:rPr>
-              <w:t>6–7</w:t>
+              <w:t>App. B.2 reproduce</w:t>
+            </w:r>
+          </w:p>
+        </w:tc>
+      </w:tr>
+      <w:tr>
+        <w:tc>
+          <w:tcPr>
+            <w:tcW w:type="dxa" w:w="2433"/>
+          </w:tcPr>
+          <w:p>
+            <w:r>
+              <w:rPr>
+                <w:sz w:val="18"/>
+              </w:rPr>
+              <w:t>9–10</w:t>
             </w:r>
           </w:p>
         </w:tc>
         <w:tc>
           <w:tcPr>
-            <w:tcW w:type="dxa" w:w="2880"/>
+            <w:tcW w:type="dxa" w:w="2433"/>
           </w:tcPr>
           <w:p>
             <w:r>
@@ -2988,7 +4222,7 @@
         </w:tc>
         <w:tc>
           <w:tcPr>
-            <w:tcW w:type="dxa" w:w="2880"/>
+            <w:tcW w:type="dxa" w:w="2433"/>
           </w:tcPr>
           <w:p>
             <w:r>
@@ -2999,12 +4233,25 @@
             </w:r>
           </w:p>
         </w:tc>
+        <w:tc>
+          <w:tcPr>
+            <w:tcW w:type="dxa" w:w="2433"/>
+          </w:tcPr>
+          <w:p>
+            <w:r>
+              <w:rPr>
+                <w:sz w:val="18"/>
+              </w:rPr>
+              <w:t>Fig. 2(b) / Fig. 1(a)</w:t>
+            </w:r>
+          </w:p>
+        </w:tc>
       </w:tr>
     </w:tbl>
     <w:p/>
     <w:sectPr>
       <w:pgSz w:w="12240" w:h="15840"/>
-      <w:pgMar w:top="1440" w:right="1800" w:bottom="1440" w:left="1800" w:header="720" w:footer="720" w:gutter="0"/>
+      <w:pgMar w:top="1440" w:right="1253" w:bottom="1440" w:left="1253" w:header="720" w:footer="720" w:gutter="0"/>
       <w:cols w:space="720"/>
       <w:docGrid w:linePitch="360"/>
     </w:sectPr>
@@ -3375,9 +4622,12 @@
     <w:name w:val="Normal"/>
     <w:qFormat/>
     <w:rsid w:val="00FC693F"/>
+    <w:pPr>
+      <w:spacing w:line="276" w:lineRule="auto" w:after="120"/>
+    </w:pPr>
     <w:rPr>
       <w:rFonts w:ascii="Times New Roman" w:hAnsi="Times New Roman"/>
-      <w:sz w:val="22"/>
+      <w:sz w:val="20"/>
     </w:rPr>
   </w:style>
   <w:style w:type="paragraph" w:styleId="Header">
@@ -3435,15 +4685,15 @@
     <w:pPr>
       <w:keepNext/>
       <w:keepLines/>
-      <w:spacing w:before="480" w:after="0"/>
+      <w:spacing w:before="200" w:after="120"/>
       <w:outlineLvl w:val="0"/>
     </w:pPr>
     <w:rPr>
-      <w:rFonts w:asciiTheme="majorHAnsi" w:eastAsiaTheme="majorEastAsia" w:hAnsiTheme="majorHAnsi" w:cstheme="majorBidi"/>
+      <w:rFonts w:asciiTheme="majorHAnsi" w:eastAsiaTheme="majorEastAsia" w:hAnsiTheme="majorHAnsi" w:cstheme="majorBidi" w:ascii="Times New Roman" w:hAnsi="Times New Roman"/>
       <w:b/>
       <w:bCs/>
       <w:color w:val="365F91" w:themeColor="accent1" w:themeShade="BF"/>
-      <w:sz w:val="28"/>
+      <w:sz w:val="24"/>
       <w:szCs w:val="28"/>
     </w:rPr>
   </w:style>
@@ -3459,15 +4709,15 @@
     <w:pPr>
       <w:keepNext/>
       <w:keepLines/>
-      <w:spacing w:before="200" w:after="0"/>
+      <w:spacing w:before="160" w:after="120"/>
       <w:outlineLvl w:val="1"/>
     </w:pPr>
     <w:rPr>
-      <w:rFonts w:asciiTheme="majorHAnsi" w:eastAsiaTheme="majorEastAsia" w:hAnsiTheme="majorHAnsi" w:cstheme="majorBidi"/>
+      <w:rFonts w:asciiTheme="majorHAnsi" w:eastAsiaTheme="majorEastAsia" w:hAnsiTheme="majorHAnsi" w:cstheme="majorBidi" w:ascii="Times New Roman" w:hAnsi="Times New Roman"/>
       <w:b/>
       <w:bCs/>
       <w:color w:val="4F81BD" w:themeColor="accent1"/>
-      <w:sz w:val="26"/>
+      <w:sz w:val="21"/>
       <w:szCs w:val="26"/>
     </w:rPr>
   </w:style>
@@ -3483,14 +4733,15 @@
     <w:pPr>
       <w:keepNext/>
       <w:keepLines/>
-      <w:spacing w:before="200" w:after="0"/>
+      <w:spacing w:before="160" w:after="120"/>
       <w:outlineLvl w:val="2"/>
     </w:pPr>
     <w:rPr>
-      <w:rFonts w:asciiTheme="majorHAnsi" w:eastAsiaTheme="majorEastAsia" w:hAnsiTheme="majorHAnsi" w:cstheme="majorBidi"/>
+      <w:rFonts w:asciiTheme="majorHAnsi" w:eastAsiaTheme="majorEastAsia" w:hAnsiTheme="majorHAnsi" w:cstheme="majorBidi" w:ascii="Times New Roman" w:hAnsi="Times New Roman"/>
       <w:b/>
       <w:bCs/>
       <w:color w:val="4F81BD" w:themeColor="accent1"/>
+      <w:sz w:val="20"/>
     </w:rPr>
   </w:style>
   <w:style w:type="paragraph" w:styleId="Heading4">

</xml_diff>